<commit_message>
feat: implement Cloud Function for image moderation using Vision API, Redis notifications, and CDN cache invalidation
</commit_message>
<xml_diff>
--- a/docs/report.docx
+++ b/docs/report.docx
@@ -93,9 +93,6 @@
     <w:p>
       <w:pPr>
         <w:pStyle w:val="ThnVnban"/>
-        <w:rPr>
-          <w:lang w:val="vi-VN"/>
-        </w:rPr>
       </w:pPr>
       <w:r>
         <w:rPr>
@@ -104,20 +101,14 @@
         </w:rPr>
         <w:t>Danh sách thành viên:</w:t>
       </w:r>
-      <w:r>
-        <w:t xml:space="preserve"> </w:t>
-      </w:r>
     </w:p>
     <w:p>
       <w:pPr>
-        <w:pStyle w:val="ThnVnban"/>
-        <w:rPr>
-          <w:lang w:val="vi-VN"/>
-        </w:rPr>
-      </w:pPr>
-      <w:r>
-        <w:t xml:space="preserve">1. </w:t>
-      </w:r>
+        <w:numPr>
+          <w:ilvl w:val="0"/>
+          <w:numId w:val="11"/>
+        </w:numPr>
+      </w:pPr>
       <w:r>
         <w:rPr>
           <w:b/>
@@ -135,65 +126,42 @@
         </w:rPr>
         <w:t>(Vai trò: Cloud &amp; Deployment)</w:t>
       </w:r>
-      <w:r>
-        <w:t xml:space="preserve"> </w:t>
-      </w:r>
     </w:p>
     <w:p>
       <w:pPr>
-        <w:pStyle w:val="ThnVnban"/>
-        <w:rPr>
-          <w:lang w:val="vi-VN"/>
-        </w:rPr>
-      </w:pPr>
-      <w:r>
-        <w:rPr>
-          <w:lang w:val="vi-VN"/>
-        </w:rPr>
-        <w:t xml:space="preserve">2. </w:t>
-      </w:r>
+        <w:numPr>
+          <w:ilvl w:val="0"/>
+          <w:numId w:val="11"/>
+        </w:numPr>
+      </w:pPr>
       <w:r>
         <w:rPr>
           <w:b/>
           <w:bCs/>
-          <w:lang w:val="vi-VN"/>
         </w:rPr>
         <w:t>Trần Hoàng Phương</w:t>
       </w:r>
       <w:r>
-        <w:rPr>
-          <w:lang w:val="vi-VN"/>
-        </w:rPr>
         <w:t xml:space="preserve"> - MSSV: 083205005715 </w:t>
       </w:r>
       <w:r>
         <w:rPr>
           <w:i/>
           <w:iCs/>
-          <w:lang w:val="vi-VN"/>
         </w:rPr>
         <w:t>(Vai trò: Backend )</w:t>
       </w:r>
-      <w:r>
-        <w:rPr>
-          <w:lang w:val="vi-VN"/>
-        </w:rPr>
-        <w:t xml:space="preserve"> </w:t>
-      </w:r>
     </w:p>
     <w:p>
       <w:pPr>
-        <w:pStyle w:val="ThnVnban"/>
+        <w:numPr>
+          <w:ilvl w:val="0"/>
+          <w:numId w:val="11"/>
+        </w:numPr>
         <w:rPr>
           <w:lang w:val="fr-FR"/>
         </w:rPr>
       </w:pPr>
-      <w:r>
-        <w:rPr>
-          <w:lang w:val="vi-VN"/>
-        </w:rPr>
-        <w:t xml:space="preserve">3. </w:t>
-      </w:r>
       <w:r>
         <w:rPr>
           <w:b/>
@@ -219,26 +187,43 @@
     </w:p>
     <w:p>
       <w:pPr>
-        <w:pStyle w:val="ThnVnban"/>
+        <w:rPr>
+          <w:lang w:val="fr-FR"/>
+        </w:rPr>
       </w:pPr>
       <w:r>
         <w:rPr>
           <w:b/>
           <w:bCs/>
+          <w:lang w:val="fr-FR"/>
         </w:rPr>
         <w:t>Link mã nguồn:</w:t>
       </w:r>
       <w:r>
+        <w:rPr>
+          <w:lang w:val="fr-FR"/>
+        </w:rPr>
         <w:t xml:space="preserve"> </w:t>
       </w:r>
       <w:hyperlink r:id="rId6">
         <w:r>
+          <w:rPr>
+            <w:lang w:val="fr-FR"/>
+          </w:rPr>
           <w:t>Đường dẫn GitHub dự án</w:t>
         </w:r>
       </w:hyperlink>
     </w:p>
     <w:p>
+      <w:pPr>
+        <w:rPr>
+          <w:lang w:val="fr-FR"/>
+        </w:rPr>
+      </w:pPr>
       <w:r>
+        <w:rPr>
+          <w:lang w:val="fr-FR"/>
+        </w:rPr>
         <w:br w:type="page"/>
       </w:r>
     </w:p>
@@ -247,7 +232,7 @@
         <w:pStyle w:val="u1"/>
       </w:pPr>
       <w:bookmarkStart w:id="0" w:name="mục-lục"/>
-      <w:bookmarkStart w:id="1" w:name="_Toc228315390"/>
+      <w:bookmarkStart w:id="1" w:name="_Toc228448674"/>
       <w:r>
         <w:lastRenderedPageBreak/>
         <w:t>MỤC LỤC</w:t>
@@ -259,7 +244,7 @@
         <w:rPr>
           <w:lang w:val="vi-VN"/>
         </w:rPr>
-        <w:id w:val="-397750642"/>
+        <w:id w:val="-196538308"/>
         <w:docPartObj>
           <w:docPartGallery w:val="Table of Contents"/>
           <w:docPartUnique/>
@@ -304,7 +289,7 @@
           <w:r>
             <w:fldChar w:fldCharType="separate"/>
           </w:r>
-          <w:hyperlink w:anchor="_Toc228315390" w:history="1">
+          <w:hyperlink w:anchor="_Toc228448674" w:history="1">
             <w:r>
               <w:rPr>
                 <w:rStyle w:val="Siuktni"/>
@@ -331,7 +316,7 @@
                 <w:noProof/>
                 <w:webHidden/>
               </w:rPr>
-              <w:instrText xml:space="preserve"> PAGEREF _Toc228315390 \h </w:instrText>
+              <w:instrText xml:space="preserve"> PAGEREF _Toc228448674 \h </w:instrText>
             </w:r>
             <w:r>
               <w:rPr>
@@ -372,7 +357,7 @@
               <w:noProof/>
             </w:rPr>
           </w:pPr>
-          <w:hyperlink w:anchor="_Toc228315391" w:history="1">
+          <w:hyperlink w:anchor="_Toc228448675" w:history="1">
             <w:r>
               <w:rPr>
                 <w:rStyle w:val="Siuktni"/>
@@ -399,7 +384,7 @@
                 <w:noProof/>
                 <w:webHidden/>
               </w:rPr>
-              <w:instrText xml:space="preserve"> PAGEREF _Toc228315391 \h </w:instrText>
+              <w:instrText xml:space="preserve"> PAGEREF _Toc228448675 \h </w:instrText>
             </w:r>
             <w:r>
               <w:rPr>
@@ -440,7 +425,7 @@
               <w:noProof/>
             </w:rPr>
           </w:pPr>
-          <w:hyperlink w:anchor="_Toc228315392" w:history="1">
+          <w:hyperlink w:anchor="_Toc228448676" w:history="1">
             <w:r>
               <w:rPr>
                 <w:rStyle w:val="Siuktni"/>
@@ -467,7 +452,7 @@
                 <w:noProof/>
                 <w:webHidden/>
               </w:rPr>
-              <w:instrText xml:space="preserve"> PAGEREF _Toc228315392 \h </w:instrText>
+              <w:instrText xml:space="preserve"> PAGEREF _Toc228448676 \h </w:instrText>
             </w:r>
             <w:r>
               <w:rPr>
@@ -508,7 +493,7 @@
               <w:noProof/>
             </w:rPr>
           </w:pPr>
-          <w:hyperlink w:anchor="_Toc228315393" w:history="1">
+          <w:hyperlink w:anchor="_Toc228448677" w:history="1">
             <w:r>
               <w:rPr>
                 <w:rStyle w:val="Siuktni"/>
@@ -535,7 +520,7 @@
                 <w:noProof/>
                 <w:webHidden/>
               </w:rPr>
-              <w:instrText xml:space="preserve"> PAGEREF _Toc228315393 \h </w:instrText>
+              <w:instrText xml:space="preserve"> PAGEREF _Toc228448677 \h </w:instrText>
             </w:r>
             <w:r>
               <w:rPr>
@@ -576,7 +561,7 @@
               <w:noProof/>
             </w:rPr>
           </w:pPr>
-          <w:hyperlink w:anchor="_Toc228315394" w:history="1">
+          <w:hyperlink w:anchor="_Toc228448678" w:history="1">
             <w:r>
               <w:rPr>
                 <w:rStyle w:val="Siuktni"/>
@@ -603,7 +588,7 @@
                 <w:noProof/>
                 <w:webHidden/>
               </w:rPr>
-              <w:instrText xml:space="preserve"> PAGEREF _Toc228315394 \h </w:instrText>
+              <w:instrText xml:space="preserve"> PAGEREF _Toc228448678 \h </w:instrText>
             </w:r>
             <w:r>
               <w:rPr>
@@ -644,7 +629,7 @@
               <w:noProof/>
             </w:rPr>
           </w:pPr>
-          <w:hyperlink w:anchor="_Toc228315395" w:history="1">
+          <w:hyperlink w:anchor="_Toc228448679" w:history="1">
             <w:r>
               <w:rPr>
                 <w:rStyle w:val="Siuktni"/>
@@ -671,7 +656,7 @@
                 <w:noProof/>
                 <w:webHidden/>
               </w:rPr>
-              <w:instrText xml:space="preserve"> PAGEREF _Toc228315395 \h </w:instrText>
+              <w:instrText xml:space="preserve"> PAGEREF _Toc228448679 \h </w:instrText>
             </w:r>
             <w:r>
               <w:rPr>
@@ -691,7 +676,7 @@
                 <w:noProof/>
                 <w:webHidden/>
               </w:rPr>
-              <w:t>3</w:t>
+              <w:t>4</w:t>
             </w:r>
             <w:r>
               <w:rPr>
@@ -712,7 +697,7 @@
               <w:noProof/>
             </w:rPr>
           </w:pPr>
-          <w:hyperlink w:anchor="_Toc228315396" w:history="1">
+          <w:hyperlink w:anchor="_Toc228448680" w:history="1">
             <w:r>
               <w:rPr>
                 <w:rStyle w:val="Siuktni"/>
@@ -739,7 +724,7 @@
                 <w:noProof/>
                 <w:webHidden/>
               </w:rPr>
-              <w:instrText xml:space="preserve"> PAGEREF _Toc228315396 \h </w:instrText>
+              <w:instrText xml:space="preserve"> PAGEREF _Toc228448680 \h </w:instrText>
             </w:r>
             <w:r>
               <w:rPr>
@@ -780,13 +765,13 @@
               <w:noProof/>
             </w:rPr>
           </w:pPr>
-          <w:hyperlink w:anchor="_Toc228315397" w:history="1">
+          <w:hyperlink w:anchor="_Toc228448681" w:history="1">
             <w:r>
               <w:rPr>
                 <w:rStyle w:val="Siuktni"/>
                 <w:noProof/>
               </w:rPr>
-              <w:t>2.1. Kiểm duyệt nội dung (Content Moderation)</w:t>
+              <w:t>2.1. Kiểm duyệt nội dung</w:t>
             </w:r>
             <w:r>
               <w:rPr>
@@ -807,7 +792,7 @@
                 <w:noProof/>
                 <w:webHidden/>
               </w:rPr>
-              <w:instrText xml:space="preserve"> PAGEREF _Toc228315397 \h </w:instrText>
+              <w:instrText xml:space="preserve"> PAGEREF _Toc228448681 \h </w:instrText>
             </w:r>
             <w:r>
               <w:rPr>
@@ -848,13 +833,13 @@
               <w:noProof/>
             </w:rPr>
           </w:pPr>
-          <w:hyperlink w:anchor="_Toc228315398" w:history="1">
+          <w:hyperlink w:anchor="_Toc228448682" w:history="1">
             <w:r>
               <w:rPr>
                 <w:rStyle w:val="Siuktni"/>
                 <w:noProof/>
               </w:rPr>
-              <w:t>2.2. Kiến trúc API Đồng bộ (Synchronous Architecture)</w:t>
+              <w:t>2.2. Kiến trúc Hướng sự kiện và Pub/Sub</w:t>
             </w:r>
             <w:r>
               <w:rPr>
@@ -875,7 +860,7 @@
                 <w:noProof/>
                 <w:webHidden/>
               </w:rPr>
-              <w:instrText xml:space="preserve"> PAGEREF _Toc228315398 \h </w:instrText>
+              <w:instrText xml:space="preserve"> PAGEREF _Toc228448682 \h </w:instrText>
             </w:r>
             <w:r>
               <w:rPr>
@@ -916,7 +901,7 @@
               <w:noProof/>
             </w:rPr>
           </w:pPr>
-          <w:hyperlink w:anchor="_Toc228315399" w:history="1">
+          <w:hyperlink w:anchor="_Toc228448683" w:history="1">
             <w:r>
               <w:rPr>
                 <w:rStyle w:val="Siuktni"/>
@@ -943,7 +928,7 @@
                 <w:noProof/>
                 <w:webHidden/>
               </w:rPr>
-              <w:instrText xml:space="preserve"> PAGEREF _Toc228315399 \h </w:instrText>
+              <w:instrText xml:space="preserve"> PAGEREF _Toc228448683 \h </w:instrText>
             </w:r>
             <w:r>
               <w:rPr>
@@ -984,7 +969,7 @@
               <w:noProof/>
             </w:rPr>
           </w:pPr>
-          <w:hyperlink w:anchor="_Toc228315400" w:history="1">
+          <w:hyperlink w:anchor="_Toc228448684" w:history="1">
             <w:r>
               <w:rPr>
                 <w:rStyle w:val="Siuktni"/>
@@ -1011,7 +996,7 @@
                 <w:noProof/>
                 <w:webHidden/>
               </w:rPr>
-              <w:instrText xml:space="preserve"> PAGEREF _Toc228315400 \h </w:instrText>
+              <w:instrText xml:space="preserve"> PAGEREF _Toc228448684 \h </w:instrText>
             </w:r>
             <w:r>
               <w:rPr>
@@ -1031,7 +1016,7 @@
                 <w:noProof/>
                 <w:webHidden/>
               </w:rPr>
-              <w:t>4</w:t>
+              <w:t>5</w:t>
             </w:r>
             <w:r>
               <w:rPr>
@@ -1052,7 +1037,7 @@
               <w:noProof/>
             </w:rPr>
           </w:pPr>
-          <w:hyperlink w:anchor="_Toc228315401" w:history="1">
+          <w:hyperlink w:anchor="_Toc228448685" w:history="1">
             <w:r>
               <w:rPr>
                 <w:rStyle w:val="Siuktni"/>
@@ -1079,7 +1064,7 @@
                 <w:noProof/>
                 <w:webHidden/>
               </w:rPr>
-              <w:instrText xml:space="preserve"> PAGEREF _Toc228315401 \h </w:instrText>
+              <w:instrText xml:space="preserve"> PAGEREF _Toc228448685 \h </w:instrText>
             </w:r>
             <w:r>
               <w:rPr>
@@ -1099,7 +1084,7 @@
                 <w:noProof/>
                 <w:webHidden/>
               </w:rPr>
-              <w:t>4</w:t>
+              <w:t>5</w:t>
             </w:r>
             <w:r>
               <w:rPr>
@@ -1120,7 +1105,7 @@
               <w:noProof/>
             </w:rPr>
           </w:pPr>
-          <w:hyperlink w:anchor="_Toc228315402" w:history="1">
+          <w:hyperlink w:anchor="_Toc228448686" w:history="1">
             <w:r>
               <w:rPr>
                 <w:rStyle w:val="Siuktni"/>
@@ -1147,7 +1132,7 @@
                 <w:noProof/>
                 <w:webHidden/>
               </w:rPr>
-              <w:instrText xml:space="preserve"> PAGEREF _Toc228315402 \h </w:instrText>
+              <w:instrText xml:space="preserve"> PAGEREF _Toc228448686 \h </w:instrText>
             </w:r>
             <w:r>
               <w:rPr>
@@ -1167,7 +1152,7 @@
                 <w:noProof/>
                 <w:webHidden/>
               </w:rPr>
-              <w:t>4</w:t>
+              <w:t>5</w:t>
             </w:r>
             <w:r>
               <w:rPr>
@@ -1188,7 +1173,7 @@
               <w:noProof/>
             </w:rPr>
           </w:pPr>
-          <w:hyperlink w:anchor="_Toc228315403" w:history="1">
+          <w:hyperlink w:anchor="_Toc228448687" w:history="1">
             <w:r>
               <w:rPr>
                 <w:rStyle w:val="Siuktni"/>
@@ -1215,7 +1200,7 @@
                 <w:noProof/>
                 <w:webHidden/>
               </w:rPr>
-              <w:instrText xml:space="preserve"> PAGEREF _Toc228315403 \h </w:instrText>
+              <w:instrText xml:space="preserve"> PAGEREF _Toc228448687 \h </w:instrText>
             </w:r>
             <w:r>
               <w:rPr>
@@ -1235,7 +1220,7 @@
                 <w:noProof/>
                 <w:webHidden/>
               </w:rPr>
-              <w:t>4</w:t>
+              <w:t>5</w:t>
             </w:r>
             <w:r>
               <w:rPr>
@@ -1256,12 +1241,11 @@
               <w:noProof/>
             </w:rPr>
           </w:pPr>
-          <w:hyperlink w:anchor="_Toc228315404" w:history="1">
+          <w:hyperlink w:anchor="_Toc228448688" w:history="1">
             <w:r>
               <w:rPr>
                 <w:rStyle w:val="Siuktni"/>
                 <w:noProof/>
-                <w:lang w:val="fr-FR"/>
               </w:rPr>
               <w:t>Non-functional (Yêu cầu phi chức năng)</w:t>
             </w:r>
@@ -1284,7 +1268,7 @@
                 <w:noProof/>
                 <w:webHidden/>
               </w:rPr>
-              <w:instrText xml:space="preserve"> PAGEREF _Toc228315404 \h </w:instrText>
+              <w:instrText xml:space="preserve"> PAGEREF _Toc228448688 \h </w:instrText>
             </w:r>
             <w:r>
               <w:rPr>
@@ -1325,7 +1309,7 @@
               <w:noProof/>
             </w:rPr>
           </w:pPr>
-          <w:hyperlink w:anchor="_Toc228315405" w:history="1">
+          <w:hyperlink w:anchor="_Toc228448689" w:history="1">
             <w:r>
               <w:rPr>
                 <w:rStyle w:val="Siuktni"/>
@@ -1352,7 +1336,7 @@
                 <w:noProof/>
                 <w:webHidden/>
               </w:rPr>
-              <w:instrText xml:space="preserve"> PAGEREF _Toc228315405 \h </w:instrText>
+              <w:instrText xml:space="preserve"> PAGEREF _Toc228448689 \h </w:instrText>
             </w:r>
             <w:r>
               <w:rPr>
@@ -1372,7 +1356,7 @@
                 <w:noProof/>
                 <w:webHidden/>
               </w:rPr>
-              <w:t>5</w:t>
+              <w:t>6</w:t>
             </w:r>
             <w:r>
               <w:rPr>
@@ -1393,7 +1377,7 @@
               <w:noProof/>
             </w:rPr>
           </w:pPr>
-          <w:hyperlink w:anchor="_Toc228315406" w:history="1">
+          <w:hyperlink w:anchor="_Toc228448690" w:history="1">
             <w:r>
               <w:rPr>
                 <w:rStyle w:val="Siuktni"/>
@@ -1420,7 +1404,7 @@
                 <w:noProof/>
                 <w:webHidden/>
               </w:rPr>
-              <w:instrText xml:space="preserve"> PAGEREF _Toc228315406 \h </w:instrText>
+              <w:instrText xml:space="preserve"> PAGEREF _Toc228448690 \h </w:instrText>
             </w:r>
             <w:r>
               <w:rPr>
@@ -1440,7 +1424,7 @@
                 <w:noProof/>
                 <w:webHidden/>
               </w:rPr>
-              <w:t>6</w:t>
+              <w:t>7</w:t>
             </w:r>
             <w:r>
               <w:rPr>
@@ -1461,7 +1445,7 @@
               <w:noProof/>
             </w:rPr>
           </w:pPr>
-          <w:hyperlink w:anchor="_Toc228315407" w:history="1">
+          <w:hyperlink w:anchor="_Toc228448691" w:history="1">
             <w:r>
               <w:rPr>
                 <w:rStyle w:val="Siuktni"/>
@@ -1488,7 +1472,7 @@
                 <w:noProof/>
                 <w:webHidden/>
               </w:rPr>
-              <w:instrText xml:space="preserve"> PAGEREF _Toc228315407 \h </w:instrText>
+              <w:instrText xml:space="preserve"> PAGEREF _Toc228448691 \h </w:instrText>
             </w:r>
             <w:r>
               <w:rPr>
@@ -1529,7 +1513,7 @@
               <w:noProof/>
             </w:rPr>
           </w:pPr>
-          <w:hyperlink w:anchor="_Toc228315408" w:history="1">
+          <w:hyperlink w:anchor="_Toc228448692" w:history="1">
             <w:r>
               <w:rPr>
                 <w:rStyle w:val="Siuktni"/>
@@ -1556,7 +1540,7 @@
                 <w:noProof/>
                 <w:webHidden/>
               </w:rPr>
-              <w:instrText xml:space="preserve"> PAGEREF _Toc228315408 \h </w:instrText>
+              <w:instrText xml:space="preserve"> PAGEREF _Toc228448692 \h </w:instrText>
             </w:r>
             <w:r>
               <w:rPr>
@@ -1597,7 +1581,7 @@
               <w:noProof/>
             </w:rPr>
           </w:pPr>
-          <w:hyperlink w:anchor="_Toc228315409" w:history="1">
+          <w:hyperlink w:anchor="_Toc228448693" w:history="1">
             <w:r>
               <w:rPr>
                 <w:rStyle w:val="Siuktni"/>
@@ -1624,7 +1608,7 @@
                 <w:noProof/>
                 <w:webHidden/>
               </w:rPr>
-              <w:instrText xml:space="preserve"> PAGEREF _Toc228315409 \h </w:instrText>
+              <w:instrText xml:space="preserve"> PAGEREF _Toc228448693 \h </w:instrText>
             </w:r>
             <w:r>
               <w:rPr>
@@ -1665,13 +1649,13 @@
               <w:noProof/>
             </w:rPr>
           </w:pPr>
-          <w:hyperlink w:anchor="_Toc228315410" w:history="1">
+          <w:hyperlink w:anchor="_Toc228448694" w:history="1">
             <w:r>
               <w:rPr>
                 <w:rStyle w:val="Siuktni"/>
                 <w:noProof/>
               </w:rPr>
-              <w:t>4.2. Cấu hình Backend (Spring Boot)</w:t>
+              <w:t>4.2. Cài đặt Cloud Function và Vision API</w:t>
             </w:r>
             <w:r>
               <w:rPr>
@@ -1692,7 +1676,7 @@
                 <w:noProof/>
                 <w:webHidden/>
               </w:rPr>
-              <w:instrText xml:space="preserve"> PAGEREF _Toc228315410 \h </w:instrText>
+              <w:instrText xml:space="preserve"> PAGEREF _Toc228448694 \h </w:instrText>
             </w:r>
             <w:r>
               <w:rPr>
@@ -1733,7 +1717,7 @@
               <w:noProof/>
             </w:rPr>
           </w:pPr>
-          <w:hyperlink w:anchor="_Toc228315411" w:history="1">
+          <w:hyperlink w:anchor="_Toc228448695" w:history="1">
             <w:r>
               <w:rPr>
                 <w:rStyle w:val="Siuktni"/>
@@ -1760,7 +1744,7 @@
                 <w:noProof/>
                 <w:webHidden/>
               </w:rPr>
-              <w:instrText xml:space="preserve"> PAGEREF _Toc228315411 \h </w:instrText>
+              <w:instrText xml:space="preserve"> PAGEREF _Toc228448695 \h </w:instrText>
             </w:r>
             <w:r>
               <w:rPr>
@@ -1801,7 +1785,7 @@
               <w:noProof/>
             </w:rPr>
           </w:pPr>
-          <w:hyperlink w:anchor="_Toc228315412" w:history="1">
+          <w:hyperlink w:anchor="_Toc228448696" w:history="1">
             <w:r>
               <w:rPr>
                 <w:rStyle w:val="Siuktni"/>
@@ -1828,7 +1812,7 @@
                 <w:noProof/>
                 <w:webHidden/>
               </w:rPr>
-              <w:instrText xml:space="preserve"> PAGEREF _Toc228315412 \h </w:instrText>
+              <w:instrText xml:space="preserve"> PAGEREF _Toc228448696 \h </w:instrText>
             </w:r>
             <w:r>
               <w:rPr>
@@ -1869,7 +1853,7 @@
               <w:noProof/>
             </w:rPr>
           </w:pPr>
-          <w:hyperlink w:anchor="_Toc228315413" w:history="1">
+          <w:hyperlink w:anchor="_Toc228448697" w:history="1">
             <w:r>
               <w:rPr>
                 <w:rStyle w:val="Siuktni"/>
@@ -1896,7 +1880,7 @@
                 <w:noProof/>
                 <w:webHidden/>
               </w:rPr>
-              <w:instrText xml:space="preserve"> PAGEREF _Toc228315413 \h </w:instrText>
+              <w:instrText xml:space="preserve"> PAGEREF _Toc228448697 \h </w:instrText>
             </w:r>
             <w:r>
               <w:rPr>
@@ -1937,7 +1921,7 @@
               <w:noProof/>
             </w:rPr>
           </w:pPr>
-          <w:hyperlink w:anchor="_Toc228315414" w:history="1">
+          <w:hyperlink w:anchor="_Toc228448698" w:history="1">
             <w:r>
               <w:rPr>
                 <w:rStyle w:val="Siuktni"/>
@@ -1964,7 +1948,7 @@
                 <w:noProof/>
                 <w:webHidden/>
               </w:rPr>
-              <w:instrText xml:space="preserve"> PAGEREF _Toc228315414 \h </w:instrText>
+              <w:instrText xml:space="preserve"> PAGEREF _Toc228448698 \h </w:instrText>
             </w:r>
             <w:r>
               <w:rPr>
@@ -2005,7 +1989,7 @@
               <w:noProof/>
             </w:rPr>
           </w:pPr>
-          <w:hyperlink w:anchor="_Toc228315415" w:history="1">
+          <w:hyperlink w:anchor="_Toc228448699" w:history="1">
             <w:r>
               <w:rPr>
                 <w:rStyle w:val="Siuktni"/>
@@ -2032,7 +2016,7 @@
                 <w:noProof/>
                 <w:webHidden/>
               </w:rPr>
-              <w:instrText xml:space="preserve"> PAGEREF _Toc228315415 \h </w:instrText>
+              <w:instrText xml:space="preserve"> PAGEREF _Toc228448699 \h </w:instrText>
             </w:r>
             <w:r>
               <w:rPr>
@@ -2073,7 +2057,7 @@
               <w:noProof/>
             </w:rPr>
           </w:pPr>
-          <w:hyperlink w:anchor="_Toc228315416" w:history="1">
+          <w:hyperlink w:anchor="_Toc228448700" w:history="1">
             <w:r>
               <w:rPr>
                 <w:rStyle w:val="Siuktni"/>
@@ -2100,7 +2084,7 @@
                 <w:noProof/>
                 <w:webHidden/>
               </w:rPr>
-              <w:instrText xml:space="preserve"> PAGEREF _Toc228315416 \h </w:instrText>
+              <w:instrText xml:space="preserve"> PAGEREF _Toc228448700 \h </w:instrText>
             </w:r>
             <w:r>
               <w:rPr>
@@ -2141,7 +2125,7 @@
               <w:noProof/>
             </w:rPr>
           </w:pPr>
-          <w:hyperlink w:anchor="_Toc228315417" w:history="1">
+          <w:hyperlink w:anchor="_Toc228448701" w:history="1">
             <w:r>
               <w:rPr>
                 <w:rStyle w:val="Siuktni"/>
@@ -2168,7 +2152,7 @@
                 <w:noProof/>
                 <w:webHidden/>
               </w:rPr>
-              <w:instrText xml:space="preserve"> PAGEREF _Toc228315417 \h </w:instrText>
+              <w:instrText xml:space="preserve"> PAGEREF _Toc228448701 \h </w:instrText>
             </w:r>
             <w:r>
               <w:rPr>
@@ -2188,7 +2172,7 @@
                 <w:noProof/>
                 <w:webHidden/>
               </w:rPr>
-              <w:t>10</w:t>
+              <w:t>9</w:t>
             </w:r>
             <w:r>
               <w:rPr>
@@ -2209,7 +2193,7 @@
               <w:noProof/>
             </w:rPr>
           </w:pPr>
-          <w:hyperlink w:anchor="_Toc228315418" w:history="1">
+          <w:hyperlink w:anchor="_Toc228448702" w:history="1">
             <w:r>
               <w:rPr>
                 <w:rStyle w:val="Siuktni"/>
@@ -2236,7 +2220,7 @@
                 <w:noProof/>
                 <w:webHidden/>
               </w:rPr>
-              <w:instrText xml:space="preserve"> PAGEREF _Toc228315418 \h </w:instrText>
+              <w:instrText xml:space="preserve"> PAGEREF _Toc228448702 \h </w:instrText>
             </w:r>
             <w:r>
               <w:rPr>
@@ -2277,7 +2261,7 @@
               <w:noProof/>
             </w:rPr>
           </w:pPr>
-          <w:hyperlink w:anchor="_Toc228315419" w:history="1">
+          <w:hyperlink w:anchor="_Toc228448703" w:history="1">
             <w:r>
               <w:rPr>
                 <w:rStyle w:val="Siuktni"/>
@@ -2304,7 +2288,7 @@
                 <w:noProof/>
                 <w:webHidden/>
               </w:rPr>
-              <w:instrText xml:space="preserve"> PAGEREF _Toc228315419 \h </w:instrText>
+              <w:instrText xml:space="preserve"> PAGEREF _Toc228448703 \h </w:instrText>
             </w:r>
             <w:r>
               <w:rPr>
@@ -2345,7 +2329,7 @@
               <w:noProof/>
             </w:rPr>
           </w:pPr>
-          <w:hyperlink w:anchor="_Toc228315420" w:history="1">
+          <w:hyperlink w:anchor="_Toc228448704" w:history="1">
             <w:r>
               <w:rPr>
                 <w:rStyle w:val="Siuktni"/>
@@ -2372,7 +2356,7 @@
                 <w:noProof/>
                 <w:webHidden/>
               </w:rPr>
-              <w:instrText xml:space="preserve"> PAGEREF _Toc228315420 \h </w:instrText>
+              <w:instrText xml:space="preserve"> PAGEREF _Toc228448704 \h </w:instrText>
             </w:r>
             <w:r>
               <w:rPr>
@@ -2427,7 +2411,7 @@
         <w:pStyle w:val="u1"/>
       </w:pPr>
       <w:bookmarkStart w:id="2" w:name="chương-1-giới-thiệu"/>
-      <w:bookmarkStart w:id="3" w:name="_Toc228315391"/>
+      <w:bookmarkStart w:id="3" w:name="_Toc228448675"/>
       <w:bookmarkEnd w:id="0"/>
       <w:r>
         <w:lastRenderedPageBreak/>
@@ -2440,7 +2424,7 @@
         <w:pStyle w:val="u2"/>
       </w:pPr>
       <w:bookmarkStart w:id="4" w:name="lý-do-chọn-đề-tài"/>
-      <w:bookmarkStart w:id="5" w:name="_Toc228315392"/>
+      <w:bookmarkStart w:id="5" w:name="_Toc228448676"/>
       <w:r>
         <w:t>1.1. Lý do chọn đề tài</w:t>
       </w:r>
@@ -2448,15 +2432,31 @@
     </w:p>
     <w:p>
       <w:r>
-        <w:t>Với sự phát triển mạnh mẽ của các nền tảng trực tuyến, mạng xã hội và các ứng dụng nhắn tin, lượng dữ liệu hình ảnh được người dùng tải lên hàng ngày là khổng lồ. Việc kiểm duyệt thủ công tốn rất nhiều thời gian, công sức và không thể đáp ứng được tốc độ phát triển của dữ liệu. Do đó, một hệ thống tải ảnh và quản lý lưu trữ an toàn, hướng tới kiểm duyệt tự động là một yêu cầu cấp thiết.</w:t>
+        <w:t>Trong bối cảnh số hóa mạnh mẽ, lượng dữ liệu hình ảnh được người dùng tải lên các nền tảng trực tuyến đang gia tăng với tốc độ chóng mặt. Việc quản lý thủ công khối lượng dữ liệu khổng lồ này không chỉ tốn kém về thời gian, công sức mà còn khó có thể đảm bảo tính nhất quán và hiệu quả. Điều này đặt ra yêu cầu cấp thiết về một hệ thống tải ảnh và quản lý lưu trữ hiện đại, tích hợp khả năng kiểm duyệt nội dung tự động.</w:t>
       </w:r>
     </w:p>
     <w:p>
       <w:pPr>
+        <w:pStyle w:val="ThnVnban"/>
+      </w:pPr>
+      <w:r>
+        <w:t>Hơn nữa, sự phát triển của trí tuệ nhân tạo đã mở ra những giải pháp đột phá cho bài toán kiểm duyệt. Các công nghệ AI như thị giác máy tính (Computer Vision) có khả năng phân tích, nhận diện và phân loại nội dung hình ảnh với độ chính xác cao, hỗ trợ đắc lực cho việc lọc bỏ các nội dung không phù hợp, đặc biệt là các hình ảnh chứa yếu tố nhạy cảm, bạo lực hoặc vi phạm tiêu chuẩn cộng đồng. Việc áp dụng AI vào quy trình này không chỉ giúp giảm tải cho con người mà còn góp phần xây dựng một môi trường số an toàn, lành mạnh, đặc biệt quan trọng đối với sự phát triển của trẻ em.</w:t>
+      </w:r>
+    </w:p>
+    <w:p>
+      <w:pPr>
+        <w:pStyle w:val="ThnVnban"/>
+      </w:pPr>
+      <w:r>
+        <w:t>Xuất phát từ những lý do trên, nhóm đã quyết định thực hiện đề tài “Hệ thống quản lý và kiểm duyệt ảnh tự động trên nền tảng Cloud”, nhằm xây dựng một giải pháp toàn diện, tận dụng sức mạnh của điện toán đám mây và trí tuệ nhân tạo để giải quyết các thách thức hiện tại trong quản lý dữ liệu hình ảnh.</w:t>
+      </w:r>
+    </w:p>
+    <w:p>
+      <w:pPr>
         <w:pStyle w:val="u2"/>
       </w:pPr>
       <w:bookmarkStart w:id="6" w:name="mục-tiêu-đề-tài"/>
-      <w:bookmarkStart w:id="7" w:name="_Toc228315393"/>
+      <w:bookmarkStart w:id="7" w:name="_Toc228448677"/>
       <w:bookmarkEnd w:id="4"/>
       <w:r>
         <w:t>1.2. Mục tiêu đề tài</w:t>
@@ -2467,7 +2467,7 @@
       <w:pPr>
         <w:numPr>
           <w:ilvl w:val="0"/>
-          <w:numId w:val="11"/>
+          <w:numId w:val="12"/>
         </w:numPr>
       </w:pPr>
       <w:r>
@@ -2478,7 +2478,7 @@
       <w:pPr>
         <w:numPr>
           <w:ilvl w:val="0"/>
-          <w:numId w:val="11"/>
+          <w:numId w:val="12"/>
         </w:numPr>
       </w:pPr>
       <w:r>
@@ -2489,7 +2489,7 @@
       <w:pPr>
         <w:numPr>
           <w:ilvl w:val="0"/>
-          <w:numId w:val="11"/>
+          <w:numId w:val="12"/>
         </w:numPr>
       </w:pPr>
       <w:r>
@@ -2501,7 +2501,7 @@
         <w:pStyle w:val="u2"/>
       </w:pPr>
       <w:bookmarkStart w:id="8" w:name="phạm-vi-đề-tài"/>
-      <w:bookmarkStart w:id="9" w:name="_Toc228315394"/>
+      <w:bookmarkStart w:id="9" w:name="_Toc228448678"/>
       <w:bookmarkEnd w:id="6"/>
       <w:r>
         <w:t>1.3. Phạm vi đề tài</w:t>
@@ -2512,44 +2512,45 @@
       <w:pPr>
         <w:numPr>
           <w:ilvl w:val="0"/>
-          <w:numId w:val="12"/>
+          <w:numId w:val="13"/>
         </w:numPr>
       </w:pPr>
       <w:r>
-        <w:t>Hệ thống tập trung vào việc xử lý và lưu trữ hình ảnh tĩnh.</w:t>
+        <w:t>Hệ thống tập trung vào xử lý và kiểm duyệt hình ảnh tĩnh.</w:t>
       </w:r>
     </w:p>
     <w:p>
       <w:pPr>
         <w:numPr>
           <w:ilvl w:val="0"/>
-          <w:numId w:val="12"/>
+          <w:numId w:val="13"/>
         </w:numPr>
       </w:pPr>
       <w:r>
-        <w:t>Sử dụng Google Cloud Storage để lưu trữ file thực tế.</w:t>
+        <w:t>Sử dụng Google Cloud Storage để lưu trữ và phân loại file thực tế.</w:t>
       </w:r>
     </w:p>
     <w:p>
       <w:pPr>
         <w:numPr>
           <w:ilvl w:val="0"/>
-          <w:numId w:val="12"/>
+          <w:numId w:val="13"/>
         </w:numPr>
       </w:pPr>
       <w:r>
-        <w:t>Backend xử lý nghiệp vụ được viết bằng Java Spring Boot, lưu trữ metadata qua MySQL.</w:t>
+        <w:t>Backend xử lý nghiệp vụ viết bằng Java Spring Boot, lưu metadata bằng MySQL.</w:t>
       </w:r>
     </w:p>
     <w:p>
       <w:pPr>
         <w:numPr>
           <w:ilvl w:val="0"/>
-          <w:numId w:val="12"/>
+          <w:numId w:val="13"/>
         </w:numPr>
       </w:pPr>
       <w:r>
-        <w:t>Frontend giao diện người dùng được xây dựng bằng thư viện React.</w:t>
+        <w:lastRenderedPageBreak/>
+        <w:t>Hệ thống kiểm duyệt tự động xử lý ngầm bằng Cloud Function (viết bằng Golang) tích hợp Google Cloud Vision API và Redis Pub/Sub.</w:t>
       </w:r>
     </w:p>
     <w:p>
@@ -2557,7 +2558,7 @@
         <w:pStyle w:val="u2"/>
       </w:pPr>
       <w:bookmarkStart w:id="10" w:name="phương-pháp-thực-hiện"/>
-      <w:bookmarkStart w:id="11" w:name="_Toc228315395"/>
+      <w:bookmarkStart w:id="11" w:name="_Toc228448679"/>
       <w:bookmarkEnd w:id="8"/>
       <w:r>
         <w:t>1.4. Phương pháp thực hiện</w:t>
@@ -2568,33 +2569,33 @@
       <w:pPr>
         <w:numPr>
           <w:ilvl w:val="0"/>
-          <w:numId w:val="13"/>
+          <w:numId w:val="14"/>
         </w:numPr>
       </w:pPr>
       <w:r>
-        <w:t>Xây dựng kiến trúc API đồng bộ (Synchronous RESTful API) giữa Frontend và Backend.</w:t>
+        <w:t>Kết hợp linh hoạt kiến trúc RESTful API đồng bộ (Frontend - Backend) và kiến trúc Event-driven (Cloud Function).</w:t>
       </w:r>
     </w:p>
     <w:p>
       <w:pPr>
         <w:numPr>
           <w:ilvl w:val="0"/>
-          <w:numId w:val="13"/>
+          <w:numId w:val="14"/>
         </w:numPr>
       </w:pPr>
       <w:r>
-        <w:t>Tận dụng sức mạnh lưu trữ đám mây của Google Cloud Platform.</w:t>
+        <w:t>Sử dụng sự kiện (Event trigger) từ Google Cloud Storage để tự động kích hoạt tiến trình kiểm duyệt bằng Vision API.</w:t>
       </w:r>
     </w:p>
     <w:p>
       <w:pPr>
         <w:numPr>
           <w:ilvl w:val="0"/>
-          <w:numId w:val="13"/>
+          <w:numId w:val="14"/>
         </w:numPr>
       </w:pPr>
       <w:r>
-        <w:t>Lên kế hoạch (dự kiến) tích hợp Google Cloud Vision API vào quy trình upload backend để đánh giá hình ảnh.</w:t>
+        <w:t>Ứng dụng Redis làm Message Broker (Pub/Sub) và Invalid Cache trên CDN để đồng bộ trạng thái luồng bất đồng bộ.</w:t>
       </w:r>
     </w:p>
     <w:p>
@@ -2602,11 +2603,10 @@
         <w:pStyle w:val="u1"/>
       </w:pPr>
       <w:bookmarkStart w:id="12" w:name="chương-2-cơ-sở-lý-thuyết"/>
-      <w:bookmarkStart w:id="13" w:name="_Toc228315396"/>
+      <w:bookmarkStart w:id="13" w:name="_Toc228448680"/>
       <w:bookmarkEnd w:id="2"/>
       <w:bookmarkEnd w:id="10"/>
       <w:r>
-        <w:lastRenderedPageBreak/>
         <w:t>CHƯƠNG 2: CƠ SỞ LÝ THUYẾT</w:t>
       </w:r>
       <w:bookmarkEnd w:id="13"/>
@@ -2615,10 +2615,10 @@
       <w:pPr>
         <w:pStyle w:val="u2"/>
       </w:pPr>
-      <w:bookmarkStart w:id="14" w:name="kiểm-duyệt-nội-dung-content-moderation"/>
-      <w:bookmarkStart w:id="15" w:name="_Toc228315397"/>
+      <w:bookmarkStart w:id="14" w:name="kiểm-duyệt-nội-dung"/>
+      <w:bookmarkStart w:id="15" w:name="_Toc228448681"/>
       <w:r>
-        <w:t>2.1. Kiểm duyệt nội dung (Content Moderation)</w:t>
+        <w:t>2.1. Kiểm duyệt nội dung</w:t>
       </w:r>
       <w:bookmarkEnd w:id="15"/>
     </w:p>
@@ -2626,7 +2626,7 @@
       <w:pPr>
         <w:numPr>
           <w:ilvl w:val="0"/>
-          <w:numId w:val="14"/>
+          <w:numId w:val="15"/>
         </w:numPr>
       </w:pPr>
       <w:r>
@@ -2644,7 +2644,7 @@
       <w:pPr>
         <w:numPr>
           <w:ilvl w:val="0"/>
-          <w:numId w:val="14"/>
+          <w:numId w:val="15"/>
         </w:numPr>
       </w:pPr>
       <w:r>
@@ -2655,18 +2655,18 @@
         <w:t>Các loại vi phạm thường gặp:</w:t>
       </w:r>
       <w:r>
-        <w:t xml:space="preserve"> Nội dung người lớn (Adult/NSFW), bạo lực (Violence), lừa đảo (Spoof), nội dung gây sốc (Medical/Racy).</w:t>
+        <w:t xml:space="preserve"> Nội dung người lớn (Adult/NSFW), bạo lực (Violence), nội dung gây sốc (Medical/Racy).</w:t>
       </w:r>
     </w:p>
     <w:p>
       <w:pPr>
         <w:pStyle w:val="u2"/>
       </w:pPr>
-      <w:bookmarkStart w:id="16" w:name="X066fd23dffab8d94a6aa893fedec6f81965c610"/>
-      <w:bookmarkStart w:id="17" w:name="_Toc228315398"/>
+      <w:bookmarkStart w:id="16" w:name="kiến-trúc-hướng-sự-kiện-và-pubsub"/>
+      <w:bookmarkStart w:id="17" w:name="_Toc228448682"/>
       <w:bookmarkEnd w:id="14"/>
       <w:r>
-        <w:t>2.2. Kiến trúc API Đồng bộ (Synchronous Architecture)</w:t>
+        <w:t>2.2. Kiến trúc Hướng sự kiện và Pub/Sub</w:t>
       </w:r>
       <w:bookmarkEnd w:id="17"/>
     </w:p>
@@ -2674,7 +2674,7 @@
       <w:pPr>
         <w:numPr>
           <w:ilvl w:val="0"/>
-          <w:numId w:val="15"/>
+          <w:numId w:val="16"/>
         </w:numPr>
       </w:pPr>
       <w:r>
@@ -2685,14 +2685,14 @@
         <w:t>Khái niệm:</w:t>
       </w:r>
       <w:r>
-        <w:t xml:space="preserve"> Các request từ client được gửi tới server và client sẽ chờ (block) cho đến khi nhận được response phản hồi từ server. Khác với kiến trúc thời gian thực (Real-time/Event-driven).</w:t>
+        <w:t xml:space="preserve"> Các thành phần trong hệ thống không giao tiếp trực tiếp mà thông qua các sự kiện (events). Khi ảnh được tải lên Storage, sự kiện sinh ra sẽ kích hoạt tự động tiến trình kiểm duyệt.</w:t>
       </w:r>
     </w:p>
     <w:p>
       <w:pPr>
         <w:numPr>
           <w:ilvl w:val="0"/>
-          <w:numId w:val="15"/>
+          <w:numId w:val="16"/>
         </w:numPr>
       </w:pPr>
       <w:r>
@@ -2700,10 +2700,10 @@
           <w:b/>
           <w:bCs/>
         </w:rPr>
-        <w:t>Ưu điểm:</w:t>
+        <w:t>Vai trò của Redis Pub/Sub:</w:t>
       </w:r>
       <w:r>
-        <w:t xml:space="preserve"> Luồng xử lý dễ hiểu, dễ kiểm soát lỗi trực tiếp ngay trong một request duy nhất. Code đơn giản, phù hợp với các ứng dụng có luồng nghiệp vụ tuần tự.</w:t>
+        <w:t xml:space="preserve"> Gửi thông báo (message) về trạng thái ảnh (bị loại bỏ hay an toàn) theo thời gian thực tới các dịch vụ đang lắng nghe mà không gây nghẽn luồng upload chính.</w:t>
       </w:r>
     </w:p>
     <w:p>
@@ -2711,7 +2711,7 @@
         <w:pStyle w:val="u2"/>
       </w:pPr>
       <w:bookmarkStart w:id="18" w:name="google-cloud-storage"/>
-      <w:bookmarkStart w:id="19" w:name="_Toc228315399"/>
+      <w:bookmarkStart w:id="19" w:name="_Toc228448683"/>
       <w:bookmarkEnd w:id="16"/>
       <w:r>
         <w:t>2.3. Google Cloud Storage</w:t>
@@ -2722,7 +2722,7 @@
       <w:pPr>
         <w:numPr>
           <w:ilvl w:val="0"/>
-          <w:numId w:val="16"/>
+          <w:numId w:val="17"/>
         </w:numPr>
       </w:pPr>
       <w:r>
@@ -2733,7 +2733,7 @@
       <w:pPr>
         <w:numPr>
           <w:ilvl w:val="0"/>
-          <w:numId w:val="16"/>
+          <w:numId w:val="17"/>
         </w:numPr>
       </w:pPr>
       <w:r>
@@ -2745,9 +2745,10 @@
         <w:pStyle w:val="u2"/>
       </w:pPr>
       <w:bookmarkStart w:id="20" w:name="cloud-vision-api-safesearch-detection"/>
-      <w:bookmarkStart w:id="21" w:name="_Toc228315400"/>
+      <w:bookmarkStart w:id="21" w:name="_Toc228448684"/>
       <w:bookmarkEnd w:id="18"/>
       <w:r>
+        <w:lastRenderedPageBreak/>
         <w:t>2.4. Cloud Vision API (SafeSearch Detection)</w:t>
       </w:r>
       <w:bookmarkEnd w:id="21"/>
@@ -2756,7 +2757,7 @@
       <w:pPr>
         <w:numPr>
           <w:ilvl w:val="0"/>
-          <w:numId w:val="17"/>
+          <w:numId w:val="18"/>
         </w:numPr>
       </w:pPr>
       <w:r>
@@ -2768,7 +2769,7 @@
         <w:pStyle w:val="u1"/>
       </w:pPr>
       <w:bookmarkStart w:id="22" w:name="chương-3-phân-tích-thiết-kế-hệ-thống"/>
-      <w:bookmarkStart w:id="23" w:name="_Toc228315401"/>
+      <w:bookmarkStart w:id="23" w:name="_Toc228448685"/>
       <w:bookmarkEnd w:id="12"/>
       <w:bookmarkEnd w:id="20"/>
       <w:r>
@@ -2781,7 +2782,7 @@
         <w:pStyle w:val="u2"/>
       </w:pPr>
       <w:bookmarkStart w:id="24" w:name="yêu-cầu-hệ-thống"/>
-      <w:bookmarkStart w:id="25" w:name="_Toc228315402"/>
+      <w:bookmarkStart w:id="25" w:name="_Toc228448686"/>
       <w:r>
         <w:t>3.1. Yêu cầu hệ thống</w:t>
       </w:r>
@@ -2792,7 +2793,7 @@
         <w:pStyle w:val="u3"/>
       </w:pPr>
       <w:bookmarkStart w:id="26" w:name="functional-yêu-cầu-chức-năng"/>
-      <w:bookmarkStart w:id="27" w:name="_Toc228315403"/>
+      <w:bookmarkStart w:id="27" w:name="_Toc228448687"/>
       <w:r>
         <w:t>Functional (Yêu cầu chức năng)</w:t>
       </w:r>
@@ -2802,7 +2803,7 @@
       <w:pPr>
         <w:numPr>
           <w:ilvl w:val="0"/>
-          <w:numId w:val="18"/>
+          <w:numId w:val="19"/>
         </w:numPr>
       </w:pPr>
       <w:r>
@@ -2813,7 +2814,7 @@
       <w:pPr>
         <w:numPr>
           <w:ilvl w:val="0"/>
-          <w:numId w:val="18"/>
+          <w:numId w:val="19"/>
         </w:numPr>
       </w:pPr>
       <w:r>
@@ -2824,11 +2825,10 @@
       <w:pPr>
         <w:numPr>
           <w:ilvl w:val="0"/>
-          <w:numId w:val="18"/>
+          <w:numId w:val="19"/>
         </w:numPr>
       </w:pPr>
       <w:r>
-        <w:lastRenderedPageBreak/>
         <w:t>Lưu trữ lịch sử tải lên trong cơ sở dữ liệu MySQL và hiển thị lại cho người dùng.</w:t>
       </w:r>
     </w:p>
@@ -2838,7 +2838,7 @@
           <w:noProof/>
         </w:rPr>
         <w:drawing>
-          <wp:inline distT="0" distB="0" distL="0" distR="0" wp14:anchorId="18991331" wp14:editId="4381F8CC">
+          <wp:inline distT="0" distB="0" distL="0" distR="0" wp14:anchorId="211EC889" wp14:editId="34FFE292">
             <wp:extent cx="4953000" cy="3530600"/>
             <wp:effectExtent l="0" t="0" r="0" b="0"/>
             <wp:docPr id="22" name="Picture" descr="Hình 3.1: Sơ đồ Use-case hệ thống"/>
@@ -2893,7 +2893,7 @@
         </w:rPr>
       </w:pPr>
       <w:bookmarkStart w:id="28" w:name="non-functional-yêu-cầu-phi-chức-năng"/>
-      <w:bookmarkStart w:id="29" w:name="_Toc228315404"/>
+      <w:bookmarkStart w:id="29" w:name="_Toc228448688"/>
       <w:bookmarkEnd w:id="26"/>
       <w:r>
         <w:rPr>
@@ -2907,7 +2907,7 @@
       <w:pPr>
         <w:numPr>
           <w:ilvl w:val="0"/>
-          <w:numId w:val="19"/>
+          <w:numId w:val="20"/>
         </w:numPr>
         <w:rPr>
           <w:lang w:val="fr-FR"/>
@@ -2924,10 +2924,11 @@
       <w:pPr>
         <w:numPr>
           <w:ilvl w:val="0"/>
-          <w:numId w:val="19"/>
+          <w:numId w:val="20"/>
         </w:numPr>
       </w:pPr>
       <w:r>
+        <w:lastRenderedPageBreak/>
         <w:t>Thời gian phản hồi API nhanh.</w:t>
       </w:r>
     </w:p>
@@ -2935,7 +2936,7 @@
       <w:pPr>
         <w:numPr>
           <w:ilvl w:val="0"/>
-          <w:numId w:val="19"/>
+          <w:numId w:val="20"/>
         </w:numPr>
       </w:pPr>
       <w:r>
@@ -2947,7 +2948,7 @@
         <w:pStyle w:val="u2"/>
       </w:pPr>
       <w:bookmarkStart w:id="30" w:name="kiến-trúc-tổng-thể"/>
-      <w:bookmarkStart w:id="31" w:name="_Toc228315405"/>
+      <w:bookmarkStart w:id="31" w:name="_Toc228448689"/>
       <w:bookmarkEnd w:id="24"/>
       <w:bookmarkEnd w:id="28"/>
       <w:r>
@@ -2957,14 +2958,14 @@
     </w:p>
     <w:p>
       <w:r>
-        <w:t>Hệ thống hiện tại được thiết kế theo mô hình Client-Server truyền thống kết hợp Cloud Storage:</w:t>
+        <w:t>Hệ thống kết hợp mô hình Client-Server truyền thống và Serverless (Event-driven):</w:t>
       </w:r>
     </w:p>
     <w:p>
       <w:pPr>
         <w:numPr>
           <w:ilvl w:val="0"/>
-          <w:numId w:val="20"/>
+          <w:numId w:val="21"/>
         </w:numPr>
       </w:pPr>
       <w:r>
@@ -2975,14 +2976,14 @@
         <w:t>Frontend (ReactJS):</w:t>
       </w:r>
       <w:r>
-        <w:t xml:space="preserve"> Giao diện cho phép người dùng chọn và tải ảnh.</w:t>
+        <w:t xml:space="preserve"> Giao diện tải ảnh lên và nhận phản hồi.</w:t>
       </w:r>
     </w:p>
     <w:p>
       <w:pPr>
         <w:numPr>
           <w:ilvl w:val="0"/>
-          <w:numId w:val="20"/>
+          <w:numId w:val="21"/>
         </w:numPr>
       </w:pPr>
       <w:r>
@@ -2993,14 +2994,14 @@
         <w:t>Backend (Java Spring Boot):</w:t>
       </w:r>
       <w:r>
-        <w:t xml:space="preserve"> Cung cấp các RESTful API cho phép upload và truy xuất ảnh.</w:t>
+        <w:t xml:space="preserve"> Lưu trữ metadata vào MySQL và Upload dữ liệu thô (raw data).</w:t>
       </w:r>
     </w:p>
     <w:p>
       <w:pPr>
         <w:numPr>
           <w:ilvl w:val="0"/>
-          <w:numId w:val="20"/>
+          <w:numId w:val="21"/>
         </w:numPr>
       </w:pPr>
       <w:r>
@@ -3008,17 +3009,17 @@
           <w:b/>
           <w:bCs/>
         </w:rPr>
-        <w:t>Database (MySQL):</w:t>
+        <w:t>Google Cloud Storage (GCS):</w:t>
       </w:r>
       <w:r>
-        <w:t xml:space="preserve"> Nơi lưu trữ thông tin metadata của ảnh.</w:t>
+        <w:t xml:space="preserve"> Lưu trữ ảnh. Được chia làm 2 bucket: Raw (chứa ảnh vừa tải lên) và Processed (ảnh đã an toàn).</w:t>
       </w:r>
     </w:p>
     <w:p>
       <w:pPr>
         <w:numPr>
           <w:ilvl w:val="0"/>
-          <w:numId w:val="20"/>
+          <w:numId w:val="21"/>
         </w:numPr>
       </w:pPr>
       <w:r>
@@ -3026,17 +3027,17 @@
           <w:b/>
           <w:bCs/>
         </w:rPr>
-        <w:t>Cloud Storage:</w:t>
+        <w:t>Cloud Function (Golang):</w:t>
       </w:r>
       <w:r>
-        <w:t xml:space="preserve"> Bucket chat-app-avt-images-raw lưu trữ hình ảnh vật lý.</w:t>
+        <w:t xml:space="preserve"> Lắng nghe sự kiện file mới từ GCS Raw để xử lý.</w:t>
       </w:r>
     </w:p>
     <w:p>
       <w:pPr>
         <w:numPr>
           <w:ilvl w:val="0"/>
-          <w:numId w:val="20"/>
+          <w:numId w:val="21"/>
         </w:numPr>
       </w:pPr>
       <w:r>
@@ -3044,11 +3045,28 @@
           <w:b/>
           <w:bCs/>
         </w:rPr>
-        <w:lastRenderedPageBreak/>
-        <w:t>Vision API (Mở rộng tương lai):</w:t>
+        <w:t>Vision API:</w:t>
       </w:r>
       <w:r>
-        <w:t xml:space="preserve"> Hệ thống chẩn đoán vi phạm.</w:t>
+        <w:t xml:space="preserve"> Nhận diện và đánh giá mức độ vi phạm SafeSearch.</w:t>
+      </w:r>
+    </w:p>
+    <w:p>
+      <w:pPr>
+        <w:numPr>
+          <w:ilvl w:val="0"/>
+          <w:numId w:val="21"/>
+        </w:numPr>
+      </w:pPr>
+      <w:r>
+        <w:rPr>
+          <w:b/>
+          <w:bCs/>
+        </w:rPr>
+        <w:t>Redis Pub/Sub &amp; Cloud CDN:</w:t>
+      </w:r>
+      <w:r>
+        <w:t xml:space="preserve"> Đẩy thông báo kết quả và xoá cache ảnh.</w:t>
       </w:r>
     </w:p>
     <w:p>
@@ -3057,8 +3075,8 @@
           <w:noProof/>
         </w:rPr>
         <w:drawing>
-          <wp:inline distT="0" distB="0" distL="0" distR="0" wp14:anchorId="6C327436" wp14:editId="66A12E1B">
-            <wp:extent cx="5715000" cy="4905579"/>
+          <wp:inline distT="0" distB="0" distL="0" distR="0" wp14:anchorId="57A3DAB9" wp14:editId="440AC353">
+            <wp:extent cx="5715000" cy="3557295"/>
             <wp:effectExtent l="0" t="0" r="0" b="0"/>
             <wp:docPr id="28" name="Picture" descr="Hình 3.2: Kiến trúc tổng thể hệ thống"/>
             <wp:cNvGraphicFramePr/>
@@ -3080,7 +3098,7 @@
                   <pic:spPr bwMode="auto">
                     <a:xfrm>
                       <a:off x="0" y="0"/>
-                      <a:ext cx="5715000" cy="4905579"/>
+                      <a:ext cx="5715000" cy="3557295"/>
                     </a:xfrm>
                     <a:prstGeom prst="rect">
                       <a:avLst/>
@@ -3109,9 +3127,10 @@
         <w:pStyle w:val="u2"/>
       </w:pPr>
       <w:bookmarkStart w:id="32" w:name="luồng-xử-lý-workflow-hệ-thống"/>
-      <w:bookmarkStart w:id="33" w:name="_Toc228315406"/>
+      <w:bookmarkStart w:id="33" w:name="_Toc228448690"/>
       <w:bookmarkEnd w:id="30"/>
       <w:r>
+        <w:lastRenderedPageBreak/>
         <w:t>3.3. Luồng xử lý (Workflow) hệ thống</w:t>
       </w:r>
       <w:bookmarkEnd w:id="33"/>
@@ -3120,7 +3139,7 @@
       <w:pPr>
         <w:numPr>
           <w:ilvl w:val="0"/>
-          <w:numId w:val="21"/>
+          <w:numId w:val="22"/>
         </w:numPr>
       </w:pPr>
       <w:r>
@@ -3128,17 +3147,17 @@
           <w:b/>
           <w:bCs/>
         </w:rPr>
-        <w:t>Gửi request:</w:t>
+        <w:t>Upload gốc:</w:t>
       </w:r>
       <w:r>
-        <w:t xml:space="preserve"> Frontend React gọi API POST /files/upload có đính kèm file ảnh.</w:t>
+        <w:t xml:space="preserve"> Frontend gọi API POST /files/upload. Backend nhận file, lưu metadata (MySQL) và đẩy byte data lên GCS (Raw bucket).</w:t>
       </w:r>
     </w:p>
     <w:p>
       <w:pPr>
         <w:numPr>
           <w:ilvl w:val="0"/>
-          <w:numId w:val="21"/>
+          <w:numId w:val="22"/>
         </w:numPr>
       </w:pPr>
       <w:r>
@@ -3146,17 +3165,17 @@
           <w:b/>
           <w:bCs/>
         </w:rPr>
-        <w:t>Xử lý Backend:</w:t>
+        <w:t>Trigger sự kiện:</w:t>
       </w:r>
       <w:r>
-        <w:t xml:space="preserve"> Spring Boot Controller tiếp nhận, kiểm tra định dạng file (chỉ cho phép PNG/JPEG), tạo mã UUID và lưu metadata vào MySQL.</w:t>
+        <w:t xml:space="preserve"> GCS kích hoạt Cloud Function (Golang) bằng sự kiện tạo mới object (Event google.storage.object.finalize).</w:t>
       </w:r>
     </w:p>
     <w:p>
       <w:pPr>
         <w:numPr>
           <w:ilvl w:val="0"/>
-          <w:numId w:val="21"/>
+          <w:numId w:val="22"/>
         </w:numPr>
       </w:pPr>
       <w:r>
@@ -3164,17 +3183,17 @@
           <w:b/>
           <w:bCs/>
         </w:rPr>
-        <w:t>Lưu trữ Cloud:</w:t>
+        <w:t>Phân tích Vision API:</w:t>
       </w:r>
       <w:r>
-        <w:t xml:space="preserve"> Backend tải byte data của file lên Google Cloud Storage qua Service Account.</w:t>
+        <w:t xml:space="preserve"> Cloud Function gửi ảnh tới Vision API để kiểm tra SafeSearch (Adult, Violence…).</w:t>
       </w:r>
     </w:p>
     <w:p>
       <w:pPr>
         <w:numPr>
           <w:ilvl w:val="0"/>
-          <w:numId w:val="21"/>
+          <w:numId w:val="22"/>
         </w:numPr>
       </w:pPr>
       <w:r>
@@ -3182,17 +3201,14 @@
           <w:b/>
           <w:bCs/>
         </w:rPr>
-        <w:t>Phản hồi:</w:t>
-      </w:r>
-      <w:r>
-        <w:t xml:space="preserve"> Backend trả về dữ liệu ảnh (bao gồm URL) cho Frontend.</w:t>
+        <w:t>Xử lý kết quả:</w:t>
       </w:r>
     </w:p>
     <w:p>
       <w:pPr>
         <w:numPr>
-          <w:ilvl w:val="0"/>
-          <w:numId w:val="21"/>
+          <w:ilvl w:val="1"/>
+          <w:numId w:val="23"/>
         </w:numPr>
       </w:pPr>
       <w:r>
@@ -3200,10 +3216,28 @@
           <w:b/>
           <w:bCs/>
         </w:rPr>
-        <w:t>Cập nhật:</w:t>
+        <w:t>Nếu vi phạm (&gt;= POSSIBLE):</w:t>
       </w:r>
       <w:r>
-        <w:t xml:space="preserve"> Frontend gọi GET /files để đồng bộ lại danh sách ảnh hiển thị.</w:t>
+        <w:t xml:space="preserve"> Xoá file khỏi Raw bucket, gửi status rejected qua Redis Pub/Sub, và xoá CDN cache.</w:t>
+      </w:r>
+    </w:p>
+    <w:p>
+      <w:pPr>
+        <w:numPr>
+          <w:ilvl w:val="1"/>
+          <w:numId w:val="23"/>
+        </w:numPr>
+      </w:pPr>
+      <w:r>
+        <w:rPr>
+          <w:b/>
+          <w:bCs/>
+        </w:rPr>
+        <w:t>Nếu an toàn:</w:t>
+      </w:r>
+      <w:r>
+        <w:t xml:space="preserve"> Copy file sang Processed bucket, xoá file ở Raw bucket, gửi status processed qua Redis Pub/Sub.</w:t>
       </w:r>
     </w:p>
     <w:p>
@@ -3211,10 +3245,9 @@
         <w:rPr>
           <w:noProof/>
         </w:rPr>
-        <w:lastRenderedPageBreak/>
         <w:drawing>
-          <wp:inline distT="0" distB="0" distL="0" distR="0" wp14:anchorId="5072B0A0" wp14:editId="5AEEDCC4">
-            <wp:extent cx="5715000" cy="2770025"/>
+          <wp:inline distT="0" distB="0" distL="0" distR="0" wp14:anchorId="6BF41201" wp14:editId="0D639BD0">
+            <wp:extent cx="5715000" cy="3273003"/>
             <wp:effectExtent l="0" t="0" r="0" b="0"/>
             <wp:docPr id="32" name="Picture" descr="Hình 3.3: Luồng xử lý hệ thống"/>
             <wp:cNvGraphicFramePr/>
@@ -3236,7 +3269,7 @@
                   <pic:spPr bwMode="auto">
                     <a:xfrm>
                       <a:off x="0" y="0"/>
-                      <a:ext cx="5715000" cy="2770025"/>
+                      <a:ext cx="5715000" cy="3273003"/>
                     </a:xfrm>
                     <a:prstGeom prst="rect">
                       <a:avLst/>
@@ -3265,7 +3298,7 @@
         <w:pStyle w:val="u2"/>
       </w:pPr>
       <w:bookmarkStart w:id="34" w:name="thiết-kế-database"/>
-      <w:bookmarkStart w:id="35" w:name="_Toc228315407"/>
+      <w:bookmarkStart w:id="35" w:name="_Toc228448691"/>
       <w:bookmarkEnd w:id="32"/>
       <w:r>
         <w:t>3.4. Thiết kế Database</w:t>
@@ -3276,7 +3309,7 @@
       <w:pPr>
         <w:numPr>
           <w:ilvl w:val="0"/>
-          <w:numId w:val="22"/>
+          <w:numId w:val="24"/>
         </w:numPr>
       </w:pPr>
       <w:r>
@@ -3297,7 +3330,7 @@
         </w:rPr>
         <w:lastRenderedPageBreak/>
         <w:drawing>
-          <wp:inline distT="0" distB="0" distL="0" distR="0" wp14:anchorId="18982199" wp14:editId="1F4DAE9F">
+          <wp:inline distT="0" distB="0" distL="0" distR="0" wp14:anchorId="415D4052" wp14:editId="317967C0">
             <wp:extent cx="5473700" cy="4546600"/>
             <wp:effectExtent l="0" t="0" r="0" b="0"/>
             <wp:docPr id="36" name="Picture" descr="Hình 3.4: Thiết kế Database"/>
@@ -3349,7 +3382,7 @@
         <w:pStyle w:val="u1"/>
       </w:pPr>
       <w:bookmarkStart w:id="36" w:name="chương-4-cài-đặt-hệ-thống"/>
-      <w:bookmarkStart w:id="37" w:name="_Toc228315408"/>
+      <w:bookmarkStart w:id="37" w:name="_Toc228448692"/>
       <w:bookmarkEnd w:id="22"/>
       <w:bookmarkEnd w:id="34"/>
       <w:r>
@@ -3362,7 +3395,7 @@
         <w:pStyle w:val="u2"/>
       </w:pPr>
       <w:bookmarkStart w:id="38" w:name="môi-trường-phát-triển"/>
-      <w:bookmarkStart w:id="39" w:name="_Toc228315409"/>
+      <w:bookmarkStart w:id="39" w:name="_Toc228448693"/>
       <w:r>
         <w:t>4.1. Môi trường phát triển</w:t>
       </w:r>
@@ -3372,7 +3405,7 @@
       <w:pPr>
         <w:numPr>
           <w:ilvl w:val="0"/>
-          <w:numId w:val="23"/>
+          <w:numId w:val="25"/>
         </w:numPr>
       </w:pPr>
       <w:r>
@@ -3390,7 +3423,7 @@
       <w:pPr>
         <w:numPr>
           <w:ilvl w:val="0"/>
-          <w:numId w:val="23"/>
+          <w:numId w:val="25"/>
         </w:numPr>
       </w:pPr>
       <w:r>
@@ -3398,17 +3431,17 @@
           <w:b/>
           <w:bCs/>
         </w:rPr>
-        <w:t>Backend:</w:t>
+        <w:t>Backend Upload:</w:t>
       </w:r>
       <w:r>
-        <w:t xml:space="preserve"> Java 17, Spring Boot, Spring Data JPA.</w:t>
+        <w:t xml:space="preserve"> Java 17, Spring Boot, MySQL 8.0.</w:t>
       </w:r>
     </w:p>
     <w:p>
       <w:pPr>
         <w:numPr>
           <w:ilvl w:val="0"/>
-          <w:numId w:val="23"/>
+          <w:numId w:val="25"/>
         </w:numPr>
       </w:pPr>
       <w:r>
@@ -3416,17 +3449,17 @@
           <w:b/>
           <w:bCs/>
         </w:rPr>
-        <w:t>Database:</w:t>
+        <w:t>Serverless &amp; AI:</w:t>
       </w:r>
       <w:r>
-        <w:t xml:space="preserve"> MySQL 8.0 (triển khai qua Docker).</w:t>
+        <w:t xml:space="preserve"> Golang 1.20+, Google Cloud Vision API, Cloud Function.</w:t>
       </w:r>
     </w:p>
     <w:p>
       <w:pPr>
         <w:numPr>
           <w:ilvl w:val="0"/>
-          <w:numId w:val="23"/>
+          <w:numId w:val="25"/>
         </w:numPr>
       </w:pPr>
       <w:r>
@@ -3434,21 +3467,21 @@
           <w:b/>
           <w:bCs/>
         </w:rPr>
-        <w:t>Cloud Provider:</w:t>
+        <w:t>Message Broker:</w:t>
       </w:r>
       <w:r>
-        <w:t xml:space="preserve"> Google Cloud Platform.</w:t>
+        <w:t xml:space="preserve"> Redis Pub/Sub.</w:t>
       </w:r>
     </w:p>
     <w:p>
       <w:pPr>
         <w:pStyle w:val="u2"/>
       </w:pPr>
-      <w:bookmarkStart w:id="40" w:name="cấu-hình-backend-spring-boot"/>
-      <w:bookmarkStart w:id="41" w:name="_Toc228315410"/>
+      <w:bookmarkStart w:id="40" w:name="cài-đặt-cloud-function-và-vision-api"/>
+      <w:bookmarkStart w:id="41" w:name="_Toc228448694"/>
       <w:bookmarkEnd w:id="38"/>
       <w:r>
-        <w:t>4.2. Cấu hình Backend (Spring Boot)</w:t>
+        <w:t>4.2. Cài đặt Cloud Function và Vision API</w:t>
       </w:r>
       <w:bookmarkEnd w:id="41"/>
     </w:p>
@@ -3456,34 +3489,34 @@
       <w:pPr>
         <w:numPr>
           <w:ilvl w:val="0"/>
-          <w:numId w:val="24"/>
+          <w:numId w:val="26"/>
         </w:numPr>
       </w:pPr>
       <w:r>
-        <w:t>Tích hợp thư viện google-cloud-storage.</w:t>
+        <w:t>Khởi tạo hàm xử lý bằng Golang, cấu hình Event Trigger lắng nghe bucket thô.</w:t>
       </w:r>
     </w:p>
     <w:p>
       <w:pPr>
         <w:numPr>
           <w:ilvl w:val="0"/>
-          <w:numId w:val="24"/>
+          <w:numId w:val="26"/>
         </w:numPr>
       </w:pPr>
       <w:r>
-        <w:lastRenderedPageBreak/>
-        <w:t>Cấu hình xác thực an toàn qua file serviceAccount.json đặt trong resources/certs/gcs/.</w:t>
+        <w:t>Sử dụng module cloud.google.com/go/vision/apiv1 để gọi DetectSafeSearch.</w:t>
       </w:r>
     </w:p>
     <w:p>
       <w:pPr>
         <w:numPr>
           <w:ilvl w:val="0"/>
-          <w:numId w:val="24"/>
+          <w:numId w:val="26"/>
         </w:numPr>
       </w:pPr>
       <w:r>
-        <w:t>Lớp FileService.java chịu trách nhiệm giao tiếp trực tiếp với MySQL và Google Cloud Storage.</w:t>
+        <w:lastRenderedPageBreak/>
+        <w:t>Tích hợp github.com/redis/go-redis/v9 để publish message qua kênh image-processing-results.</w:t>
       </w:r>
     </w:p>
     <w:p>
@@ -3491,7 +3524,7 @@
         <w:pStyle w:val="u2"/>
       </w:pPr>
       <w:bookmarkStart w:id="42" w:name="cài-đặt-frontend-react"/>
-      <w:bookmarkStart w:id="43" w:name="_Toc228315411"/>
+      <w:bookmarkStart w:id="43" w:name="_Toc228448695"/>
       <w:bookmarkEnd w:id="40"/>
       <w:r>
         <w:t>4.3. Cài đặt Frontend (React)</w:t>
@@ -3502,7 +3535,7 @@
       <w:pPr>
         <w:numPr>
           <w:ilvl w:val="0"/>
-          <w:numId w:val="25"/>
+          <w:numId w:val="27"/>
         </w:numPr>
       </w:pPr>
       <w:r>
@@ -3513,7 +3546,7 @@
       <w:pPr>
         <w:numPr>
           <w:ilvl w:val="0"/>
-          <w:numId w:val="25"/>
+          <w:numId w:val="27"/>
         </w:numPr>
       </w:pPr>
       <w:r>
@@ -3525,7 +3558,7 @@
         <w:pStyle w:val="u2"/>
       </w:pPr>
       <w:bookmarkStart w:id="44" w:name="cấu-hình-google-cloud-storage"/>
-      <w:bookmarkStart w:id="45" w:name="_Toc228315412"/>
+      <w:bookmarkStart w:id="45" w:name="_Toc228448696"/>
       <w:bookmarkEnd w:id="42"/>
       <w:r>
         <w:t>4.4. Cấu hình Google Cloud Storage</w:t>
@@ -3536,7 +3569,7 @@
       <w:pPr>
         <w:numPr>
           <w:ilvl w:val="0"/>
-          <w:numId w:val="26"/>
+          <w:numId w:val="28"/>
         </w:numPr>
       </w:pPr>
       <w:r>
@@ -3547,7 +3580,7 @@
       <w:pPr>
         <w:numPr>
           <w:ilvl w:val="0"/>
-          <w:numId w:val="26"/>
+          <w:numId w:val="28"/>
         </w:numPr>
       </w:pPr>
       <w:r>
@@ -3559,7 +3592,7 @@
         <w:pStyle w:val="u1"/>
       </w:pPr>
       <w:bookmarkStart w:id="46" w:name="chương-5-kết-quả-đánh-giá"/>
-      <w:bookmarkStart w:id="47" w:name="_Toc228315413"/>
+      <w:bookmarkStart w:id="47" w:name="_Toc228448697"/>
       <w:bookmarkEnd w:id="36"/>
       <w:bookmarkEnd w:id="44"/>
       <w:r>
@@ -3572,7 +3605,7 @@
         <w:pStyle w:val="u2"/>
       </w:pPr>
       <w:bookmarkStart w:id="48" w:name="kết-quả-đạt-được"/>
-      <w:bookmarkStart w:id="49" w:name="_Toc228315414"/>
+      <w:bookmarkStart w:id="49" w:name="_Toc228448698"/>
       <w:r>
         <w:t>5.1. Kết quả đạt được</w:t>
       </w:r>
@@ -3582,7 +3615,7 @@
       <w:pPr>
         <w:numPr>
           <w:ilvl w:val="0"/>
-          <w:numId w:val="27"/>
+          <w:numId w:val="29"/>
         </w:numPr>
       </w:pPr>
       <w:r>
@@ -3593,22 +3626,22 @@
       <w:pPr>
         <w:numPr>
           <w:ilvl w:val="0"/>
-          <w:numId w:val="27"/>
+          <w:numId w:val="29"/>
         </w:numPr>
       </w:pPr>
       <w:r>
-        <w:t>Hoàn thiện luồng upload đồng bộ từ Frontend tới Cloud Storage.</w:t>
+        <w:t>Hoàn thiện toàn bộ luồng pipeline: Upload đồng bộ -&gt; Trigger sự kiện -&gt; Phân tích bằng Vision API -&gt; Gửi kết quả qua Redis.</w:t>
       </w:r>
     </w:p>
     <w:p>
       <w:pPr>
         <w:numPr>
           <w:ilvl w:val="0"/>
-          <w:numId w:val="27"/>
+          <w:numId w:val="29"/>
         </w:numPr>
       </w:pPr>
       <w:r>
-        <w:t>Ứng dụng hoạt động ổn định, dữ liệu nhất quán giữa MySQL và Google Cloud.</w:t>
+        <w:t>Tự động thanh lọc dữ liệu: Các ảnh vi phạm đều bị xóa ngay lập tức khỏi Storage và CDN.</w:t>
       </w:r>
     </w:p>
     <w:p>
@@ -3616,7 +3649,7 @@
         <w:pStyle w:val="u2"/>
       </w:pPr>
       <w:bookmarkStart w:id="50" w:name="đánh-giá"/>
-      <w:bookmarkStart w:id="51" w:name="_Toc228315415"/>
+      <w:bookmarkStart w:id="51" w:name="_Toc228448699"/>
       <w:bookmarkEnd w:id="48"/>
       <w:r>
         <w:t>5.2. Đánh giá</w:t>
@@ -3628,7 +3661,7 @@
         <w:pStyle w:val="u3"/>
       </w:pPr>
       <w:bookmarkStart w:id="52" w:name="ưu-điểm"/>
-      <w:bookmarkStart w:id="53" w:name="_Toc228315416"/>
+      <w:bookmarkStart w:id="53" w:name="_Toc228448700"/>
       <w:r>
         <w:t>Ưu điểm</w:t>
       </w:r>
@@ -3638,7 +3671,7 @@
       <w:pPr>
         <w:numPr>
           <w:ilvl w:val="0"/>
-          <w:numId w:val="28"/>
+          <w:numId w:val="30"/>
         </w:numPr>
       </w:pPr>
       <w:r>
@@ -3649,7 +3682,7 @@
       <w:pPr>
         <w:numPr>
           <w:ilvl w:val="0"/>
-          <w:numId w:val="28"/>
+          <w:numId w:val="30"/>
         </w:numPr>
       </w:pPr>
       <w:r>
@@ -3661,10 +3694,9 @@
         <w:pStyle w:val="u3"/>
       </w:pPr>
       <w:bookmarkStart w:id="54" w:name="nhược-điểm"/>
-      <w:bookmarkStart w:id="55" w:name="_Toc228315417"/>
+      <w:bookmarkStart w:id="55" w:name="_Toc228448701"/>
       <w:bookmarkEnd w:id="52"/>
       <w:r>
-        <w:lastRenderedPageBreak/>
         <w:t>Nhược điểm</w:t>
       </w:r>
       <w:bookmarkEnd w:id="55"/>
@@ -3673,7 +3705,7 @@
       <w:pPr>
         <w:numPr>
           <w:ilvl w:val="0"/>
-          <w:numId w:val="29"/>
+          <w:numId w:val="31"/>
         </w:numPr>
       </w:pPr>
       <w:r>
@@ -3684,10 +3716,11 @@
       <w:pPr>
         <w:numPr>
           <w:ilvl w:val="0"/>
-          <w:numId w:val="29"/>
+          <w:numId w:val="31"/>
         </w:numPr>
       </w:pPr>
       <w:r>
+        <w:lastRenderedPageBreak/>
         <w:t>Chưa có kiến trúc Event-driven (như Pub/Sub) để xử lý dữ liệu lớn theo thời gian thực.</w:t>
       </w:r>
     </w:p>
@@ -3696,7 +3729,7 @@
         <w:pStyle w:val="u1"/>
       </w:pPr>
       <w:bookmarkStart w:id="56" w:name="chương-6-hướng-phát-triển"/>
-      <w:bookmarkStart w:id="57" w:name="_Toc228315418"/>
+      <w:bookmarkStart w:id="57" w:name="_Toc228448702"/>
       <w:bookmarkEnd w:id="46"/>
       <w:bookmarkEnd w:id="50"/>
       <w:bookmarkEnd w:id="54"/>
@@ -3709,18 +3742,7 @@
       <w:pPr>
         <w:numPr>
           <w:ilvl w:val="0"/>
-          <w:numId w:val="30"/>
-        </w:numPr>
-      </w:pPr>
-      <w:r>
-        <w:t>Tích hợp chính thức thư viện Google Cloud Vision API vào Backend để hệ thống tự động từ chối ngay các file vi phạm khi upload.</w:t>
-      </w:r>
-    </w:p>
-    <w:p>
-      <w:pPr>
-        <w:numPr>
-          <w:ilvl w:val="0"/>
-          <w:numId w:val="30"/>
+          <w:numId w:val="32"/>
         </w:numPr>
       </w:pPr>
       <w:r>
@@ -3731,7 +3753,7 @@
       <w:pPr>
         <w:numPr>
           <w:ilvl w:val="0"/>
-          <w:numId w:val="30"/>
+          <w:numId w:val="32"/>
         </w:numPr>
       </w:pPr>
       <w:r>
@@ -3743,7 +3765,7 @@
         <w:pStyle w:val="u1"/>
       </w:pPr>
       <w:bookmarkStart w:id="58" w:name="chương-7-kết-luận"/>
-      <w:bookmarkStart w:id="59" w:name="_Toc228315419"/>
+      <w:bookmarkStart w:id="59" w:name="_Toc228448703"/>
       <w:bookmarkEnd w:id="56"/>
       <w:r>
         <w:t>CHƯƠNG 7: KẾT LUẬN</w:t>
@@ -3760,7 +3782,7 @@
         <w:pStyle w:val="u1"/>
       </w:pPr>
       <w:bookmarkStart w:id="60" w:name="tài-liệu-tham-khảo"/>
-      <w:bookmarkStart w:id="61" w:name="_Toc228315420"/>
+      <w:bookmarkStart w:id="61" w:name="_Toc228448704"/>
       <w:bookmarkEnd w:id="58"/>
       <w:r>
         <w:t>TÀI LIỆU THAM KHẢO</w:t>
@@ -3771,7 +3793,7 @@
       <w:pPr>
         <w:numPr>
           <w:ilvl w:val="0"/>
-          <w:numId w:val="31"/>
+          <w:numId w:val="33"/>
         </w:numPr>
       </w:pPr>
       <w:r>
@@ -3782,7 +3804,7 @@
       <w:pPr>
         <w:numPr>
           <w:ilvl w:val="0"/>
-          <w:numId w:val="31"/>
+          <w:numId w:val="33"/>
         </w:numPr>
       </w:pPr>
       <w:r>
@@ -3793,7 +3815,7 @@
       <w:pPr>
         <w:numPr>
           <w:ilvl w:val="0"/>
-          <w:numId w:val="31"/>
+          <w:numId w:val="33"/>
         </w:numPr>
       </w:pPr>
       <w:r>
@@ -3987,7 +4009,7 @@
   <w:abstractNum w:abstractNumId="9" w15:restartNumberingAfterBreak="0">
     <w:nsid w:val="0000A990"/>
     <w:multiLevelType w:val="multilevel"/>
-    <w:tmpl w:val="81BEC5DC"/>
+    <w:tmpl w:val="72A814A6"/>
     <w:lvl w:ilvl="0">
       <w:numFmt w:val="bullet"/>
       <w:lvlText w:val=" "/>
@@ -4064,7 +4086,7 @@
   <w:abstractNum w:abstractNumId="10" w15:restartNumberingAfterBreak="0">
     <w:nsid w:val="0000A991"/>
     <w:multiLevelType w:val="multilevel"/>
-    <w:tmpl w:val="5E845F58"/>
+    <w:tmpl w:val="FC3C2658"/>
     <w:lvl w:ilvl="0">
       <w:numFmt w:val="bullet"/>
       <w:lvlText w:val=""/>
@@ -4168,7 +4190,7 @@
   <w:abstractNum w:abstractNumId="11" w15:restartNumberingAfterBreak="0">
     <w:nsid w:val="00A99411"/>
     <w:multiLevelType w:val="multilevel"/>
-    <w:tmpl w:val="6598EE78"/>
+    <w:tmpl w:val="596E358A"/>
     <w:lvl w:ilvl="0">
       <w:start w:val="1"/>
       <w:numFmt w:val="decimal"/>
@@ -4278,37 +4300,10 @@
   <w:num w:numId="9" w16cid:durableId="2008286336">
     <w:abstractNumId w:val="0"/>
   </w:num>
-  <w:num w:numId="10" w16cid:durableId="496459285">
+  <w:num w:numId="10" w16cid:durableId="2000111237">
     <w:abstractNumId w:val="9"/>
   </w:num>
-  <w:num w:numId="11" w16cid:durableId="846863582">
-    <w:abstractNumId w:val="10"/>
-  </w:num>
-  <w:num w:numId="12" w16cid:durableId="1981497659">
-    <w:abstractNumId w:val="10"/>
-  </w:num>
-  <w:num w:numId="13" w16cid:durableId="1708875260">
-    <w:abstractNumId w:val="10"/>
-  </w:num>
-  <w:num w:numId="14" w16cid:durableId="1829133063">
-    <w:abstractNumId w:val="10"/>
-  </w:num>
-  <w:num w:numId="15" w16cid:durableId="1915623961">
-    <w:abstractNumId w:val="10"/>
-  </w:num>
-  <w:num w:numId="16" w16cid:durableId="1474903107">
-    <w:abstractNumId w:val="10"/>
-  </w:num>
-  <w:num w:numId="17" w16cid:durableId="1728187146">
-    <w:abstractNumId w:val="10"/>
-  </w:num>
-  <w:num w:numId="18" w16cid:durableId="946229160">
-    <w:abstractNumId w:val="10"/>
-  </w:num>
-  <w:num w:numId="19" w16cid:durableId="1335382778">
-    <w:abstractNumId w:val="10"/>
-  </w:num>
-  <w:num w:numId="20" w16cid:durableId="1782146095">
+  <w:num w:numId="11" w16cid:durableId="2088989834">
     <w:abstractNumId w:val="11"/>
     <w:lvlOverride w:ilvl="0">
       <w:startOverride w:val="1"/>
@@ -4338,7 +4333,34 @@
       <w:startOverride w:val="1"/>
     </w:lvlOverride>
   </w:num>
-  <w:num w:numId="21" w16cid:durableId="810293713">
+  <w:num w:numId="12" w16cid:durableId="1647664498">
+    <w:abstractNumId w:val="10"/>
+  </w:num>
+  <w:num w:numId="13" w16cid:durableId="813110139">
+    <w:abstractNumId w:val="10"/>
+  </w:num>
+  <w:num w:numId="14" w16cid:durableId="1452820462">
+    <w:abstractNumId w:val="10"/>
+  </w:num>
+  <w:num w:numId="15" w16cid:durableId="1417433455">
+    <w:abstractNumId w:val="10"/>
+  </w:num>
+  <w:num w:numId="16" w16cid:durableId="1516338742">
+    <w:abstractNumId w:val="10"/>
+  </w:num>
+  <w:num w:numId="17" w16cid:durableId="1232733879">
+    <w:abstractNumId w:val="10"/>
+  </w:num>
+  <w:num w:numId="18" w16cid:durableId="1230771560">
+    <w:abstractNumId w:val="10"/>
+  </w:num>
+  <w:num w:numId="19" w16cid:durableId="89547794">
+    <w:abstractNumId w:val="10"/>
+  </w:num>
+  <w:num w:numId="20" w16cid:durableId="2100514577">
+    <w:abstractNumId w:val="10"/>
+  </w:num>
+  <w:num w:numId="21" w16cid:durableId="790516168">
     <w:abstractNumId w:val="11"/>
     <w:lvlOverride w:ilvl="0">
       <w:startOverride w:val="1"/>
@@ -4368,34 +4390,67 @@
       <w:startOverride w:val="1"/>
     </w:lvlOverride>
   </w:num>
-  <w:num w:numId="22" w16cid:durableId="1935941039">
+  <w:num w:numId="22" w16cid:durableId="448822889">
+    <w:abstractNumId w:val="11"/>
+    <w:lvlOverride w:ilvl="0">
+      <w:startOverride w:val="1"/>
+    </w:lvlOverride>
+    <w:lvlOverride w:ilvl="1">
+      <w:startOverride w:val="1"/>
+    </w:lvlOverride>
+    <w:lvlOverride w:ilvl="2">
+      <w:startOverride w:val="1"/>
+    </w:lvlOverride>
+    <w:lvlOverride w:ilvl="3">
+      <w:startOverride w:val="1"/>
+    </w:lvlOverride>
+    <w:lvlOverride w:ilvl="4">
+      <w:startOverride w:val="1"/>
+    </w:lvlOverride>
+    <w:lvlOverride w:ilvl="5">
+      <w:startOverride w:val="1"/>
+    </w:lvlOverride>
+    <w:lvlOverride w:ilvl="6">
+      <w:startOverride w:val="1"/>
+    </w:lvlOverride>
+    <w:lvlOverride w:ilvl="7">
+      <w:startOverride w:val="1"/>
+    </w:lvlOverride>
+    <w:lvlOverride w:ilvl="8">
+      <w:startOverride w:val="1"/>
+    </w:lvlOverride>
+  </w:num>
+  <w:num w:numId="23" w16cid:durableId="1731883670">
     <w:abstractNumId w:val="10"/>
   </w:num>
-  <w:num w:numId="23" w16cid:durableId="387649578">
+  <w:num w:numId="24" w16cid:durableId="213932797">
     <w:abstractNumId w:val="10"/>
   </w:num>
-  <w:num w:numId="24" w16cid:durableId="126777162">
+  <w:num w:numId="25" w16cid:durableId="652874985">
     <w:abstractNumId w:val="10"/>
   </w:num>
-  <w:num w:numId="25" w16cid:durableId="1622030132">
+  <w:num w:numId="26" w16cid:durableId="966278030">
     <w:abstractNumId w:val="10"/>
   </w:num>
-  <w:num w:numId="26" w16cid:durableId="1547062810">
+  <w:num w:numId="27" w16cid:durableId="203446485">
     <w:abstractNumId w:val="10"/>
   </w:num>
-  <w:num w:numId="27" w16cid:durableId="1346439485">
+  <w:num w:numId="28" w16cid:durableId="825903669">
     <w:abstractNumId w:val="10"/>
   </w:num>
-  <w:num w:numId="28" w16cid:durableId="366180943">
+  <w:num w:numId="29" w16cid:durableId="1205484104">
     <w:abstractNumId w:val="10"/>
   </w:num>
-  <w:num w:numId="29" w16cid:durableId="1953584621">
+  <w:num w:numId="30" w16cid:durableId="420222802">
     <w:abstractNumId w:val="10"/>
   </w:num>
-  <w:num w:numId="30" w16cid:durableId="1822694381">
+  <w:num w:numId="31" w16cid:durableId="1700549772">
     <w:abstractNumId w:val="10"/>
   </w:num>
-  <w:num w:numId="31" w16cid:durableId="109782699">
+  <w:num w:numId="32" w16cid:durableId="327101196">
+    <w:abstractNumId w:val="10"/>
+  </w:num>
+  <w:num w:numId="33" w16cid:durableId="1420131191">
     <w:abstractNumId w:val="11"/>
     <w:lvlOverride w:ilvl="0">
       <w:startOverride w:val="1"/>
@@ -16006,7 +16061,7 @@
     <w:autoRedefine/>
     <w:uiPriority w:val="39"/>
     <w:unhideWhenUsed/>
-    <w:rsid w:val="00A825F6"/>
+    <w:rsid w:val="005D75F8"/>
     <w:pPr>
       <w:spacing w:after="100"/>
     </w:pPr>
@@ -16018,7 +16073,7 @@
     <w:autoRedefine/>
     <w:uiPriority w:val="39"/>
     <w:unhideWhenUsed/>
-    <w:rsid w:val="00A825F6"/>
+    <w:rsid w:val="005D75F8"/>
     <w:pPr>
       <w:spacing w:after="100"/>
       <w:ind w:left="260"/>
@@ -16031,7 +16086,7 @@
     <w:autoRedefine/>
     <w:uiPriority w:val="39"/>
     <w:unhideWhenUsed/>
-    <w:rsid w:val="00A825F6"/>
+    <w:rsid w:val="005D75F8"/>
     <w:pPr>
       <w:spacing w:after="100"/>
       <w:ind w:left="520"/>
@@ -16042,7 +16097,7 @@
     <w:basedOn w:val="Phngmcinhcuaoanvn"/>
     <w:uiPriority w:val="99"/>
     <w:unhideWhenUsed/>
-    <w:rsid w:val="00A825F6"/>
+    <w:rsid w:val="005D75F8"/>
     <w:rPr>
       <w:color w:val="0000FF" w:themeColor="hyperlink"/>
       <w:u w:val="single"/>
@@ -16376,7 +16431,7 @@
 </file>
 
 <file path=customXml/itemProps1.xml><?xml version="1.0" encoding="utf-8"?>
-<ds:datastoreItem xmlns:ds="http://schemas.openxmlformats.org/officeDocument/2006/customXml" ds:itemID="{EB98DD81-69EB-4865-BBA7-0A2AA837FBB1}">
+<ds:datastoreItem xmlns:ds="http://schemas.openxmlformats.org/officeDocument/2006/customXml" ds:itemID="{DC9C389E-9EC5-441E-8598-29606390DBC8}">
   <ds:schemaRefs>
     <ds:schemaRef ds:uri="http://schemas.openxmlformats.org/officeDocument/2006/bibliography"/>
   </ds:schemaRefs>

</xml_diff>

<commit_message>
refactor: remove outdated architecture and sequence diagrams, update report document
</commit_message>
<xml_diff>
--- a/docs/report.docx
+++ b/docs/report.docx
@@ -230,21 +230,49 @@
     <w:p>
       <w:pPr>
         <w:pStyle w:val="u1"/>
+        <w:rPr>
+          <w:lang w:val="fr-FR"/>
+        </w:rPr>
       </w:pPr>
       <w:bookmarkStart w:id="0" w:name="mục-lục"/>
-      <w:bookmarkStart w:id="1" w:name="_Toc228448674"/>
+      <w:bookmarkStart w:id="1" w:name="_Toc228449127"/>
       <w:r>
+        <w:rPr>
+          <w:lang w:val="fr-FR"/>
+        </w:rPr>
         <w:lastRenderedPageBreak/>
         <w:t>MỤC LỤC</w:t>
       </w:r>
       <w:bookmarkEnd w:id="1"/>
+    </w:p>
+    <w:p>
+      <w:pPr>
+        <w:rPr>
+          <w:lang w:val="fr-FR"/>
+        </w:rPr>
+      </w:pPr>
+      <w:r>
+        <w:fldChar w:fldCharType="begin"/>
+      </w:r>
+      <w:r>
+        <w:rPr>
+          <w:lang w:val="fr-FR"/>
+        </w:rPr>
+        <w:instrText xml:space="preserve"> TOC \o "1-3" \h \z \u </w:instrText>
+      </w:r>
+      <w:r>
+        <w:fldChar w:fldCharType="separate"/>
+      </w:r>
+      <w:r>
+        <w:fldChar w:fldCharType="end"/>
+      </w:r>
     </w:p>
     <w:sdt>
       <w:sdtPr>
         <w:rPr>
           <w:lang w:val="vi-VN"/>
         </w:rPr>
-        <w:id w:val="-196538308"/>
+        <w:id w:val="963694065"/>
         <w:docPartObj>
           <w:docPartGallery w:val="Table of Contents"/>
           <w:docPartUnique/>
@@ -289,11 +317,12 @@
           <w:r>
             <w:fldChar w:fldCharType="separate"/>
           </w:r>
-          <w:hyperlink w:anchor="_Toc228448674" w:history="1">
+          <w:hyperlink w:anchor="_Toc228449127" w:history="1">
             <w:r>
               <w:rPr>
                 <w:rStyle w:val="Siuktni"/>
                 <w:noProof/>
+                <w:lang w:val="fr-FR"/>
               </w:rPr>
               <w:t>MỤC LỤC</w:t>
             </w:r>
@@ -316,7 +345,7 @@
                 <w:noProof/>
                 <w:webHidden/>
               </w:rPr>
-              <w:instrText xml:space="preserve"> PAGEREF _Toc228448674 \h </w:instrText>
+              <w:instrText xml:space="preserve"> PAGEREF _Toc228449127 \h </w:instrText>
             </w:r>
             <w:r>
               <w:rPr>
@@ -357,11 +386,12 @@
               <w:noProof/>
             </w:rPr>
           </w:pPr>
-          <w:hyperlink w:anchor="_Toc228448675" w:history="1">
+          <w:hyperlink w:anchor="_Toc228449128" w:history="1">
             <w:r>
               <w:rPr>
                 <w:rStyle w:val="Siuktni"/>
                 <w:noProof/>
+                <w:lang w:val="fr-FR"/>
               </w:rPr>
               <w:t>CHƯƠNG 1: GIỚI THIỆU</w:t>
             </w:r>
@@ -384,7 +414,7 @@
                 <w:noProof/>
                 <w:webHidden/>
               </w:rPr>
-              <w:instrText xml:space="preserve"> PAGEREF _Toc228448675 \h </w:instrText>
+              <w:instrText xml:space="preserve"> PAGEREF _Toc228449128 \h </w:instrText>
             </w:r>
             <w:r>
               <w:rPr>
@@ -425,11 +455,12 @@
               <w:noProof/>
             </w:rPr>
           </w:pPr>
-          <w:hyperlink w:anchor="_Toc228448676" w:history="1">
+          <w:hyperlink w:anchor="_Toc228449129" w:history="1">
             <w:r>
               <w:rPr>
                 <w:rStyle w:val="Siuktni"/>
                 <w:noProof/>
+                <w:lang w:val="fr-FR"/>
               </w:rPr>
               <w:t>1.1. Lý do chọn đề tài</w:t>
             </w:r>
@@ -452,7 +483,7 @@
                 <w:noProof/>
                 <w:webHidden/>
               </w:rPr>
-              <w:instrText xml:space="preserve"> PAGEREF _Toc228448676 \h </w:instrText>
+              <w:instrText xml:space="preserve"> PAGEREF _Toc228449129 \h </w:instrText>
             </w:r>
             <w:r>
               <w:rPr>
@@ -493,7 +524,7 @@
               <w:noProof/>
             </w:rPr>
           </w:pPr>
-          <w:hyperlink w:anchor="_Toc228448677" w:history="1">
+          <w:hyperlink w:anchor="_Toc228449130" w:history="1">
             <w:r>
               <w:rPr>
                 <w:rStyle w:val="Siuktni"/>
@@ -520,7 +551,7 @@
                 <w:noProof/>
                 <w:webHidden/>
               </w:rPr>
-              <w:instrText xml:space="preserve"> PAGEREF _Toc228448677 \h </w:instrText>
+              <w:instrText xml:space="preserve"> PAGEREF _Toc228449130 \h </w:instrText>
             </w:r>
             <w:r>
               <w:rPr>
@@ -561,7 +592,7 @@
               <w:noProof/>
             </w:rPr>
           </w:pPr>
-          <w:hyperlink w:anchor="_Toc228448678" w:history="1">
+          <w:hyperlink w:anchor="_Toc228449131" w:history="1">
             <w:r>
               <w:rPr>
                 <w:rStyle w:val="Siuktni"/>
@@ -588,7 +619,7 @@
                 <w:noProof/>
                 <w:webHidden/>
               </w:rPr>
-              <w:instrText xml:space="preserve"> PAGEREF _Toc228448678 \h </w:instrText>
+              <w:instrText xml:space="preserve"> PAGEREF _Toc228449131 \h </w:instrText>
             </w:r>
             <w:r>
               <w:rPr>
@@ -629,7 +660,7 @@
               <w:noProof/>
             </w:rPr>
           </w:pPr>
-          <w:hyperlink w:anchor="_Toc228448679" w:history="1">
+          <w:hyperlink w:anchor="_Toc228449132" w:history="1">
             <w:r>
               <w:rPr>
                 <w:rStyle w:val="Siuktni"/>
@@ -656,7 +687,7 @@
                 <w:noProof/>
                 <w:webHidden/>
               </w:rPr>
-              <w:instrText xml:space="preserve"> PAGEREF _Toc228448679 \h </w:instrText>
+              <w:instrText xml:space="preserve"> PAGEREF _Toc228449132 \h </w:instrText>
             </w:r>
             <w:r>
               <w:rPr>
@@ -697,7 +728,7 @@
               <w:noProof/>
             </w:rPr>
           </w:pPr>
-          <w:hyperlink w:anchor="_Toc228448680" w:history="1">
+          <w:hyperlink w:anchor="_Toc228449133" w:history="1">
             <w:r>
               <w:rPr>
                 <w:rStyle w:val="Siuktni"/>
@@ -724,7 +755,7 @@
                 <w:noProof/>
                 <w:webHidden/>
               </w:rPr>
-              <w:instrText xml:space="preserve"> PAGEREF _Toc228448680 \h </w:instrText>
+              <w:instrText xml:space="preserve"> PAGEREF _Toc228449133 \h </w:instrText>
             </w:r>
             <w:r>
               <w:rPr>
@@ -765,7 +796,7 @@
               <w:noProof/>
             </w:rPr>
           </w:pPr>
-          <w:hyperlink w:anchor="_Toc228448681" w:history="1">
+          <w:hyperlink w:anchor="_Toc228449134" w:history="1">
             <w:r>
               <w:rPr>
                 <w:rStyle w:val="Siuktni"/>
@@ -792,7 +823,7 @@
                 <w:noProof/>
                 <w:webHidden/>
               </w:rPr>
-              <w:instrText xml:space="preserve"> PAGEREF _Toc228448681 \h </w:instrText>
+              <w:instrText xml:space="preserve"> PAGEREF _Toc228449134 \h </w:instrText>
             </w:r>
             <w:r>
               <w:rPr>
@@ -833,7 +864,7 @@
               <w:noProof/>
             </w:rPr>
           </w:pPr>
-          <w:hyperlink w:anchor="_Toc228448682" w:history="1">
+          <w:hyperlink w:anchor="_Toc228449135" w:history="1">
             <w:r>
               <w:rPr>
                 <w:rStyle w:val="Siuktni"/>
@@ -860,7 +891,7 @@
                 <w:noProof/>
                 <w:webHidden/>
               </w:rPr>
-              <w:instrText xml:space="preserve"> PAGEREF _Toc228448682 \h </w:instrText>
+              <w:instrText xml:space="preserve"> PAGEREF _Toc228449135 \h </w:instrText>
             </w:r>
             <w:r>
               <w:rPr>
@@ -901,7 +932,7 @@
               <w:noProof/>
             </w:rPr>
           </w:pPr>
-          <w:hyperlink w:anchor="_Toc228448683" w:history="1">
+          <w:hyperlink w:anchor="_Toc228449136" w:history="1">
             <w:r>
               <w:rPr>
                 <w:rStyle w:val="Siuktni"/>
@@ -928,7 +959,7 @@
                 <w:noProof/>
                 <w:webHidden/>
               </w:rPr>
-              <w:instrText xml:space="preserve"> PAGEREF _Toc228448683 \h </w:instrText>
+              <w:instrText xml:space="preserve"> PAGEREF _Toc228449136 \h </w:instrText>
             </w:r>
             <w:r>
               <w:rPr>
@@ -969,7 +1000,7 @@
               <w:noProof/>
             </w:rPr>
           </w:pPr>
-          <w:hyperlink w:anchor="_Toc228448684" w:history="1">
+          <w:hyperlink w:anchor="_Toc228449137" w:history="1">
             <w:r>
               <w:rPr>
                 <w:rStyle w:val="Siuktni"/>
@@ -996,7 +1027,7 @@
                 <w:noProof/>
                 <w:webHidden/>
               </w:rPr>
-              <w:instrText xml:space="preserve"> PAGEREF _Toc228448684 \h </w:instrText>
+              <w:instrText xml:space="preserve"> PAGEREF _Toc228449137 \h </w:instrText>
             </w:r>
             <w:r>
               <w:rPr>
@@ -1037,7 +1068,7 @@
               <w:noProof/>
             </w:rPr>
           </w:pPr>
-          <w:hyperlink w:anchor="_Toc228448685" w:history="1">
+          <w:hyperlink w:anchor="_Toc228449138" w:history="1">
             <w:r>
               <w:rPr>
                 <w:rStyle w:val="Siuktni"/>
@@ -1064,7 +1095,7 @@
                 <w:noProof/>
                 <w:webHidden/>
               </w:rPr>
-              <w:instrText xml:space="preserve"> PAGEREF _Toc228448685 \h </w:instrText>
+              <w:instrText xml:space="preserve"> PAGEREF _Toc228449138 \h </w:instrText>
             </w:r>
             <w:r>
               <w:rPr>
@@ -1105,7 +1136,7 @@
               <w:noProof/>
             </w:rPr>
           </w:pPr>
-          <w:hyperlink w:anchor="_Toc228448686" w:history="1">
+          <w:hyperlink w:anchor="_Toc228449139" w:history="1">
             <w:r>
               <w:rPr>
                 <w:rStyle w:val="Siuktni"/>
@@ -1132,7 +1163,7 @@
                 <w:noProof/>
                 <w:webHidden/>
               </w:rPr>
-              <w:instrText xml:space="preserve"> PAGEREF _Toc228448686 \h </w:instrText>
+              <w:instrText xml:space="preserve"> PAGEREF _Toc228449139 \h </w:instrText>
             </w:r>
             <w:r>
               <w:rPr>
@@ -1173,7 +1204,7 @@
               <w:noProof/>
             </w:rPr>
           </w:pPr>
-          <w:hyperlink w:anchor="_Toc228448687" w:history="1">
+          <w:hyperlink w:anchor="_Toc228449140" w:history="1">
             <w:r>
               <w:rPr>
                 <w:rStyle w:val="Siuktni"/>
@@ -1200,7 +1231,7 @@
                 <w:noProof/>
                 <w:webHidden/>
               </w:rPr>
-              <w:instrText xml:space="preserve"> PAGEREF _Toc228448687 \h </w:instrText>
+              <w:instrText xml:space="preserve"> PAGEREF _Toc228449140 \h </w:instrText>
             </w:r>
             <w:r>
               <w:rPr>
@@ -1241,11 +1272,12 @@
               <w:noProof/>
             </w:rPr>
           </w:pPr>
-          <w:hyperlink w:anchor="_Toc228448688" w:history="1">
+          <w:hyperlink w:anchor="_Toc228449141" w:history="1">
             <w:r>
               <w:rPr>
                 <w:rStyle w:val="Siuktni"/>
                 <w:noProof/>
+                <w:lang w:val="fr-FR"/>
               </w:rPr>
               <w:t>Non-functional (Yêu cầu phi chức năng)</w:t>
             </w:r>
@@ -1268,7 +1300,7 @@
                 <w:noProof/>
                 <w:webHidden/>
               </w:rPr>
-              <w:instrText xml:space="preserve"> PAGEREF _Toc228448688 \h </w:instrText>
+              <w:instrText xml:space="preserve"> PAGEREF _Toc228449141 \h </w:instrText>
             </w:r>
             <w:r>
               <w:rPr>
@@ -1309,7 +1341,7 @@
               <w:noProof/>
             </w:rPr>
           </w:pPr>
-          <w:hyperlink w:anchor="_Toc228448689" w:history="1">
+          <w:hyperlink w:anchor="_Toc228449142" w:history="1">
             <w:r>
               <w:rPr>
                 <w:rStyle w:val="Siuktni"/>
@@ -1336,7 +1368,7 @@
                 <w:noProof/>
                 <w:webHidden/>
               </w:rPr>
-              <w:instrText xml:space="preserve"> PAGEREF _Toc228448689 \h </w:instrText>
+              <w:instrText xml:space="preserve"> PAGEREF _Toc228449142 \h </w:instrText>
             </w:r>
             <w:r>
               <w:rPr>
@@ -1377,7 +1409,7 @@
               <w:noProof/>
             </w:rPr>
           </w:pPr>
-          <w:hyperlink w:anchor="_Toc228448690" w:history="1">
+          <w:hyperlink w:anchor="_Toc228449143" w:history="1">
             <w:r>
               <w:rPr>
                 <w:rStyle w:val="Siuktni"/>
@@ -1404,7 +1436,7 @@
                 <w:noProof/>
                 <w:webHidden/>
               </w:rPr>
-              <w:instrText xml:space="preserve"> PAGEREF _Toc228448690 \h </w:instrText>
+              <w:instrText xml:space="preserve"> PAGEREF _Toc228449143 \h </w:instrText>
             </w:r>
             <w:r>
               <w:rPr>
@@ -1445,7 +1477,7 @@
               <w:noProof/>
             </w:rPr>
           </w:pPr>
-          <w:hyperlink w:anchor="_Toc228448691" w:history="1">
+          <w:hyperlink w:anchor="_Toc228449144" w:history="1">
             <w:r>
               <w:rPr>
                 <w:rStyle w:val="Siuktni"/>
@@ -1472,7 +1504,7 @@
                 <w:noProof/>
                 <w:webHidden/>
               </w:rPr>
-              <w:instrText xml:space="preserve"> PAGEREF _Toc228448691 \h </w:instrText>
+              <w:instrText xml:space="preserve"> PAGEREF _Toc228449144 \h </w:instrText>
             </w:r>
             <w:r>
               <w:rPr>
@@ -1513,7 +1545,7 @@
               <w:noProof/>
             </w:rPr>
           </w:pPr>
-          <w:hyperlink w:anchor="_Toc228448692" w:history="1">
+          <w:hyperlink w:anchor="_Toc228449145" w:history="1">
             <w:r>
               <w:rPr>
                 <w:rStyle w:val="Siuktni"/>
@@ -1540,7 +1572,7 @@
                 <w:noProof/>
                 <w:webHidden/>
               </w:rPr>
-              <w:instrText xml:space="preserve"> PAGEREF _Toc228448692 \h </w:instrText>
+              <w:instrText xml:space="preserve"> PAGEREF _Toc228449145 \h </w:instrText>
             </w:r>
             <w:r>
               <w:rPr>
@@ -1581,7 +1613,7 @@
               <w:noProof/>
             </w:rPr>
           </w:pPr>
-          <w:hyperlink w:anchor="_Toc228448693" w:history="1">
+          <w:hyperlink w:anchor="_Toc228449146" w:history="1">
             <w:r>
               <w:rPr>
                 <w:rStyle w:val="Siuktni"/>
@@ -1608,7 +1640,7 @@
                 <w:noProof/>
                 <w:webHidden/>
               </w:rPr>
-              <w:instrText xml:space="preserve"> PAGEREF _Toc228448693 \h </w:instrText>
+              <w:instrText xml:space="preserve"> PAGEREF _Toc228449146 \h </w:instrText>
             </w:r>
             <w:r>
               <w:rPr>
@@ -1649,7 +1681,7 @@
               <w:noProof/>
             </w:rPr>
           </w:pPr>
-          <w:hyperlink w:anchor="_Toc228448694" w:history="1">
+          <w:hyperlink w:anchor="_Toc228449147" w:history="1">
             <w:r>
               <w:rPr>
                 <w:rStyle w:val="Siuktni"/>
@@ -1676,7 +1708,7 @@
                 <w:noProof/>
                 <w:webHidden/>
               </w:rPr>
-              <w:instrText xml:space="preserve"> PAGEREF _Toc228448694 \h </w:instrText>
+              <w:instrText xml:space="preserve"> PAGEREF _Toc228449147 \h </w:instrText>
             </w:r>
             <w:r>
               <w:rPr>
@@ -1717,7 +1749,7 @@
               <w:noProof/>
             </w:rPr>
           </w:pPr>
-          <w:hyperlink w:anchor="_Toc228448695" w:history="1">
+          <w:hyperlink w:anchor="_Toc228449148" w:history="1">
             <w:r>
               <w:rPr>
                 <w:rStyle w:val="Siuktni"/>
@@ -1744,7 +1776,7 @@
                 <w:noProof/>
                 <w:webHidden/>
               </w:rPr>
-              <w:instrText xml:space="preserve"> PAGEREF _Toc228448695 \h </w:instrText>
+              <w:instrText xml:space="preserve"> PAGEREF _Toc228449148 \h </w:instrText>
             </w:r>
             <w:r>
               <w:rPr>
@@ -1785,7 +1817,7 @@
               <w:noProof/>
             </w:rPr>
           </w:pPr>
-          <w:hyperlink w:anchor="_Toc228448696" w:history="1">
+          <w:hyperlink w:anchor="_Toc228449149" w:history="1">
             <w:r>
               <w:rPr>
                 <w:rStyle w:val="Siuktni"/>
@@ -1812,7 +1844,7 @@
                 <w:noProof/>
                 <w:webHidden/>
               </w:rPr>
-              <w:instrText xml:space="preserve"> PAGEREF _Toc228448696 \h </w:instrText>
+              <w:instrText xml:space="preserve"> PAGEREF _Toc228449149 \h </w:instrText>
             </w:r>
             <w:r>
               <w:rPr>
@@ -1853,7 +1885,7 @@
               <w:noProof/>
             </w:rPr>
           </w:pPr>
-          <w:hyperlink w:anchor="_Toc228448697" w:history="1">
+          <w:hyperlink w:anchor="_Toc228449150" w:history="1">
             <w:r>
               <w:rPr>
                 <w:rStyle w:val="Siuktni"/>
@@ -1880,7 +1912,7 @@
                 <w:noProof/>
                 <w:webHidden/>
               </w:rPr>
-              <w:instrText xml:space="preserve"> PAGEREF _Toc228448697 \h </w:instrText>
+              <w:instrText xml:space="preserve"> PAGEREF _Toc228449150 \h </w:instrText>
             </w:r>
             <w:r>
               <w:rPr>
@@ -1921,7 +1953,7 @@
               <w:noProof/>
             </w:rPr>
           </w:pPr>
-          <w:hyperlink w:anchor="_Toc228448698" w:history="1">
+          <w:hyperlink w:anchor="_Toc228449151" w:history="1">
             <w:r>
               <w:rPr>
                 <w:rStyle w:val="Siuktni"/>
@@ -1948,7 +1980,7 @@
                 <w:noProof/>
                 <w:webHidden/>
               </w:rPr>
-              <w:instrText xml:space="preserve"> PAGEREF _Toc228448698 \h </w:instrText>
+              <w:instrText xml:space="preserve"> PAGEREF _Toc228449151 \h </w:instrText>
             </w:r>
             <w:r>
               <w:rPr>
@@ -1989,7 +2021,7 @@
               <w:noProof/>
             </w:rPr>
           </w:pPr>
-          <w:hyperlink w:anchor="_Toc228448699" w:history="1">
+          <w:hyperlink w:anchor="_Toc228449152" w:history="1">
             <w:r>
               <w:rPr>
                 <w:rStyle w:val="Siuktni"/>
@@ -2016,7 +2048,7 @@
                 <w:noProof/>
                 <w:webHidden/>
               </w:rPr>
-              <w:instrText xml:space="preserve"> PAGEREF _Toc228448699 \h </w:instrText>
+              <w:instrText xml:space="preserve"> PAGEREF _Toc228449152 \h </w:instrText>
             </w:r>
             <w:r>
               <w:rPr>
@@ -2057,7 +2089,7 @@
               <w:noProof/>
             </w:rPr>
           </w:pPr>
-          <w:hyperlink w:anchor="_Toc228448700" w:history="1">
+          <w:hyperlink w:anchor="_Toc228449153" w:history="1">
             <w:r>
               <w:rPr>
                 <w:rStyle w:val="Siuktni"/>
@@ -2084,7 +2116,7 @@
                 <w:noProof/>
                 <w:webHidden/>
               </w:rPr>
-              <w:instrText xml:space="preserve"> PAGEREF _Toc228448700 \h </w:instrText>
+              <w:instrText xml:space="preserve"> PAGEREF _Toc228449153 \h </w:instrText>
             </w:r>
             <w:r>
               <w:rPr>
@@ -2125,7 +2157,7 @@
               <w:noProof/>
             </w:rPr>
           </w:pPr>
-          <w:hyperlink w:anchor="_Toc228448701" w:history="1">
+          <w:hyperlink w:anchor="_Toc228449154" w:history="1">
             <w:r>
               <w:rPr>
                 <w:rStyle w:val="Siuktni"/>
@@ -2152,7 +2184,7 @@
                 <w:noProof/>
                 <w:webHidden/>
               </w:rPr>
-              <w:instrText xml:space="preserve"> PAGEREF _Toc228448701 \h </w:instrText>
+              <w:instrText xml:space="preserve"> PAGEREF _Toc228449154 \h </w:instrText>
             </w:r>
             <w:r>
               <w:rPr>
@@ -2193,7 +2225,7 @@
               <w:noProof/>
             </w:rPr>
           </w:pPr>
-          <w:hyperlink w:anchor="_Toc228448702" w:history="1">
+          <w:hyperlink w:anchor="_Toc228449155" w:history="1">
             <w:r>
               <w:rPr>
                 <w:rStyle w:val="Siuktni"/>
@@ -2220,7 +2252,7 @@
                 <w:noProof/>
                 <w:webHidden/>
               </w:rPr>
-              <w:instrText xml:space="preserve"> PAGEREF _Toc228448702 \h </w:instrText>
+              <w:instrText xml:space="preserve"> PAGEREF _Toc228449155 \h </w:instrText>
             </w:r>
             <w:r>
               <w:rPr>
@@ -2261,7 +2293,7 @@
               <w:noProof/>
             </w:rPr>
           </w:pPr>
-          <w:hyperlink w:anchor="_Toc228448703" w:history="1">
+          <w:hyperlink w:anchor="_Toc228449156" w:history="1">
             <w:r>
               <w:rPr>
                 <w:rStyle w:val="Siuktni"/>
@@ -2288,7 +2320,7 @@
                 <w:noProof/>
                 <w:webHidden/>
               </w:rPr>
-              <w:instrText xml:space="preserve"> PAGEREF _Toc228448703 \h </w:instrText>
+              <w:instrText xml:space="preserve"> PAGEREF _Toc228449156 \h </w:instrText>
             </w:r>
             <w:r>
               <w:rPr>
@@ -2329,7 +2361,7 @@
               <w:noProof/>
             </w:rPr>
           </w:pPr>
-          <w:hyperlink w:anchor="_Toc228448704" w:history="1">
+          <w:hyperlink w:anchor="_Toc228449157" w:history="1">
             <w:r>
               <w:rPr>
                 <w:rStyle w:val="Siuktni"/>
@@ -2356,7 +2388,7 @@
                 <w:noProof/>
                 <w:webHidden/>
               </w:rPr>
-              <w:instrText xml:space="preserve"> PAGEREF _Toc228448704 \h </w:instrText>
+              <w:instrText xml:space="preserve"> PAGEREF _Toc228449157 \h </w:instrText>
             </w:r>
             <w:r>
               <w:rPr>
@@ -2399,21 +2431,32 @@
       </w:sdtContent>
     </w:sdt>
     <w:p>
-      <w:fldSimple w:instr=" TOC \o &quot;1-3&quot; \h \z \u "/>
-    </w:p>
-    <w:p>
+      <w:pPr>
+        <w:rPr>
+          <w:lang w:val="fr-FR"/>
+        </w:rPr>
+      </w:pPr>
       <w:r>
+        <w:rPr>
+          <w:lang w:val="fr-FR"/>
+        </w:rPr>
         <w:br w:type="page"/>
       </w:r>
     </w:p>
     <w:p>
       <w:pPr>
         <w:pStyle w:val="u1"/>
+        <w:rPr>
+          <w:lang w:val="fr-FR"/>
+        </w:rPr>
       </w:pPr>
       <w:bookmarkStart w:id="2" w:name="chương-1-giới-thiệu"/>
-      <w:bookmarkStart w:id="3" w:name="_Toc228448675"/>
+      <w:bookmarkStart w:id="3" w:name="_Toc228449128"/>
       <w:bookmarkEnd w:id="0"/>
       <w:r>
+        <w:rPr>
+          <w:lang w:val="fr-FR"/>
+        </w:rPr>
         <w:lastRenderedPageBreak/>
         <w:t>CHƯƠNG 1: GIỚI THIỆU</w:t>
       </w:r>
@@ -2422,32 +2465,58 @@
     <w:p>
       <w:pPr>
         <w:pStyle w:val="u2"/>
+        <w:rPr>
+          <w:lang w:val="fr-FR"/>
+        </w:rPr>
       </w:pPr>
       <w:bookmarkStart w:id="4" w:name="lý-do-chọn-đề-tài"/>
-      <w:bookmarkStart w:id="5" w:name="_Toc228448676"/>
+      <w:bookmarkStart w:id="5" w:name="_Toc228449129"/>
       <w:r>
+        <w:rPr>
+          <w:lang w:val="fr-FR"/>
+        </w:rPr>
         <w:t>1.1. Lý do chọn đề tài</w:t>
       </w:r>
       <w:bookmarkEnd w:id="5"/>
     </w:p>
     <w:p>
+      <w:pPr>
+        <w:rPr>
+          <w:lang w:val="fr-FR"/>
+        </w:rPr>
+      </w:pPr>
       <w:r>
+        <w:rPr>
+          <w:lang w:val="fr-FR"/>
+        </w:rPr>
         <w:t>Trong bối cảnh số hóa mạnh mẽ, lượng dữ liệu hình ảnh được người dùng tải lên các nền tảng trực tuyến đang gia tăng với tốc độ chóng mặt. Việc quản lý thủ công khối lượng dữ liệu khổng lồ này không chỉ tốn kém về thời gian, công sức mà còn khó có thể đảm bảo tính nhất quán và hiệu quả. Điều này đặt ra yêu cầu cấp thiết về một hệ thống tải ảnh và quản lý lưu trữ hiện đại, tích hợp khả năng kiểm duyệt nội dung tự động.</w:t>
       </w:r>
     </w:p>
     <w:p>
       <w:pPr>
         <w:pStyle w:val="ThnVnban"/>
+        <w:rPr>
+          <w:lang w:val="fr-FR"/>
+        </w:rPr>
       </w:pPr>
       <w:r>
+        <w:rPr>
+          <w:lang w:val="fr-FR"/>
+        </w:rPr>
         <w:t>Hơn nữa, sự phát triển của trí tuệ nhân tạo đã mở ra những giải pháp đột phá cho bài toán kiểm duyệt. Các công nghệ AI như thị giác máy tính (Computer Vision) có khả năng phân tích, nhận diện và phân loại nội dung hình ảnh với độ chính xác cao, hỗ trợ đắc lực cho việc lọc bỏ các nội dung không phù hợp, đặc biệt là các hình ảnh chứa yếu tố nhạy cảm, bạo lực hoặc vi phạm tiêu chuẩn cộng đồng. Việc áp dụng AI vào quy trình này không chỉ giúp giảm tải cho con người mà còn góp phần xây dựng một môi trường số an toàn, lành mạnh, đặc biệt quan trọng đối với sự phát triển của trẻ em.</w:t>
       </w:r>
     </w:p>
     <w:p>
       <w:pPr>
         <w:pStyle w:val="ThnVnban"/>
+        <w:rPr>
+          <w:lang w:val="fr-FR"/>
+        </w:rPr>
       </w:pPr>
       <w:r>
+        <w:rPr>
+          <w:lang w:val="fr-FR"/>
+        </w:rPr>
         <w:t>Xuất phát từ những lý do trên, nhóm đã quyết định thực hiện đề tài “Hệ thống quản lý và kiểm duyệt ảnh tự động trên nền tảng Cloud”, nhằm xây dựng một giải pháp toàn diện, tận dụng sức mạnh của điện toán đám mây và trí tuệ nhân tạo để giải quyết các thách thức hiện tại trong quản lý dữ liệu hình ảnh.</w:t>
       </w:r>
     </w:p>
@@ -2456,7 +2525,7 @@
         <w:pStyle w:val="u2"/>
       </w:pPr>
       <w:bookmarkStart w:id="6" w:name="mục-tiêu-đề-tài"/>
-      <w:bookmarkStart w:id="7" w:name="_Toc228448677"/>
+      <w:bookmarkStart w:id="7" w:name="_Toc228449130"/>
       <w:bookmarkEnd w:id="4"/>
       <w:r>
         <w:t>1.2. Mục tiêu đề tài</w:t>
@@ -2501,7 +2570,7 @@
         <w:pStyle w:val="u2"/>
       </w:pPr>
       <w:bookmarkStart w:id="8" w:name="phạm-vi-đề-tài"/>
-      <w:bookmarkStart w:id="9" w:name="_Toc228448678"/>
+      <w:bookmarkStart w:id="9" w:name="_Toc228449131"/>
       <w:bookmarkEnd w:id="6"/>
       <w:r>
         <w:t>1.3. Phạm vi đề tài</w:t>
@@ -2558,7 +2627,7 @@
         <w:pStyle w:val="u2"/>
       </w:pPr>
       <w:bookmarkStart w:id="10" w:name="phương-pháp-thực-hiện"/>
-      <w:bookmarkStart w:id="11" w:name="_Toc228448679"/>
+      <w:bookmarkStart w:id="11" w:name="_Toc228449132"/>
       <w:bookmarkEnd w:id="8"/>
       <w:r>
         <w:t>1.4. Phương pháp thực hiện</w:t>
@@ -2603,7 +2672,7 @@
         <w:pStyle w:val="u1"/>
       </w:pPr>
       <w:bookmarkStart w:id="12" w:name="chương-2-cơ-sở-lý-thuyết"/>
-      <w:bookmarkStart w:id="13" w:name="_Toc228448680"/>
+      <w:bookmarkStart w:id="13" w:name="_Toc228449133"/>
       <w:bookmarkEnd w:id="2"/>
       <w:bookmarkEnd w:id="10"/>
       <w:r>
@@ -2616,7 +2685,7 @@
         <w:pStyle w:val="u2"/>
       </w:pPr>
       <w:bookmarkStart w:id="14" w:name="kiểm-duyệt-nội-dung"/>
-      <w:bookmarkStart w:id="15" w:name="_Toc228448681"/>
+      <w:bookmarkStart w:id="15" w:name="_Toc228449134"/>
       <w:r>
         <w:t>2.1. Kiểm duyệt nội dung</w:t>
       </w:r>
@@ -2663,7 +2732,7 @@
         <w:pStyle w:val="u2"/>
       </w:pPr>
       <w:bookmarkStart w:id="16" w:name="kiến-trúc-hướng-sự-kiện-và-pubsub"/>
-      <w:bookmarkStart w:id="17" w:name="_Toc228448682"/>
+      <w:bookmarkStart w:id="17" w:name="_Toc228449135"/>
       <w:bookmarkEnd w:id="14"/>
       <w:r>
         <w:t>2.2. Kiến trúc Hướng sự kiện và Pub/Sub</w:t>
@@ -2711,7 +2780,7 @@
         <w:pStyle w:val="u2"/>
       </w:pPr>
       <w:bookmarkStart w:id="18" w:name="google-cloud-storage"/>
-      <w:bookmarkStart w:id="19" w:name="_Toc228448683"/>
+      <w:bookmarkStart w:id="19" w:name="_Toc228449136"/>
       <w:bookmarkEnd w:id="16"/>
       <w:r>
         <w:t>2.3. Google Cloud Storage</w:t>
@@ -2745,7 +2814,7 @@
         <w:pStyle w:val="u2"/>
       </w:pPr>
       <w:bookmarkStart w:id="20" w:name="cloud-vision-api-safesearch-detection"/>
-      <w:bookmarkStart w:id="21" w:name="_Toc228448684"/>
+      <w:bookmarkStart w:id="21" w:name="_Toc228449137"/>
       <w:bookmarkEnd w:id="18"/>
       <w:r>
         <w:lastRenderedPageBreak/>
@@ -2769,7 +2838,7 @@
         <w:pStyle w:val="u1"/>
       </w:pPr>
       <w:bookmarkStart w:id="22" w:name="chương-3-phân-tích-thiết-kế-hệ-thống"/>
-      <w:bookmarkStart w:id="23" w:name="_Toc228448685"/>
+      <w:bookmarkStart w:id="23" w:name="_Toc228449138"/>
       <w:bookmarkEnd w:id="12"/>
       <w:bookmarkEnd w:id="20"/>
       <w:r>
@@ -2782,7 +2851,7 @@
         <w:pStyle w:val="u2"/>
       </w:pPr>
       <w:bookmarkStart w:id="24" w:name="yêu-cầu-hệ-thống"/>
-      <w:bookmarkStart w:id="25" w:name="_Toc228448686"/>
+      <w:bookmarkStart w:id="25" w:name="_Toc228449139"/>
       <w:r>
         <w:t>3.1. Yêu cầu hệ thống</w:t>
       </w:r>
@@ -2793,7 +2862,7 @@
         <w:pStyle w:val="u3"/>
       </w:pPr>
       <w:bookmarkStart w:id="26" w:name="functional-yêu-cầu-chức-năng"/>
-      <w:bookmarkStart w:id="27" w:name="_Toc228448687"/>
+      <w:bookmarkStart w:id="27" w:name="_Toc228449140"/>
       <w:r>
         <w:t>Functional (Yêu cầu chức năng)</w:t>
       </w:r>
@@ -2838,7 +2907,7 @@
           <w:noProof/>
         </w:rPr>
         <w:drawing>
-          <wp:inline distT="0" distB="0" distL="0" distR="0" wp14:anchorId="211EC889" wp14:editId="34FFE292">
+          <wp:inline distT="0" distB="0" distL="0" distR="0" wp14:anchorId="52213128" wp14:editId="5E67B328">
             <wp:extent cx="4953000" cy="3530600"/>
             <wp:effectExtent l="0" t="0" r="0" b="0"/>
             <wp:docPr id="22" name="Picture" descr="Hình 3.1: Sơ đồ Use-case hệ thống"/>
@@ -2893,7 +2962,7 @@
         </w:rPr>
       </w:pPr>
       <w:bookmarkStart w:id="28" w:name="non-functional-yêu-cầu-phi-chức-năng"/>
-      <w:bookmarkStart w:id="29" w:name="_Toc228448688"/>
+      <w:bookmarkStart w:id="29" w:name="_Toc228449141"/>
       <w:bookmarkEnd w:id="26"/>
       <w:r>
         <w:rPr>
@@ -2948,7 +3017,7 @@
         <w:pStyle w:val="u2"/>
       </w:pPr>
       <w:bookmarkStart w:id="30" w:name="kiến-trúc-tổng-thể"/>
-      <w:bookmarkStart w:id="31" w:name="_Toc228448689"/>
+      <w:bookmarkStart w:id="31" w:name="_Toc228449142"/>
       <w:bookmarkEnd w:id="24"/>
       <w:bookmarkEnd w:id="28"/>
       <w:r>
@@ -3075,8 +3144,8 @@
           <w:noProof/>
         </w:rPr>
         <w:drawing>
-          <wp:inline distT="0" distB="0" distL="0" distR="0" wp14:anchorId="57A3DAB9" wp14:editId="440AC353">
-            <wp:extent cx="5715000" cy="3557295"/>
+          <wp:inline distT="0" distB="0" distL="0" distR="0" wp14:anchorId="4B50E763" wp14:editId="79C9A358">
+            <wp:extent cx="5715000" cy="3553490"/>
             <wp:effectExtent l="0" t="0" r="0" b="0"/>
             <wp:docPr id="28" name="Picture" descr="Hình 3.2: Kiến trúc tổng thể hệ thống"/>
             <wp:cNvGraphicFramePr/>
@@ -3098,7 +3167,7 @@
                   <pic:spPr bwMode="auto">
                     <a:xfrm>
                       <a:off x="0" y="0"/>
-                      <a:ext cx="5715000" cy="3557295"/>
+                      <a:ext cx="5715000" cy="3553490"/>
                     </a:xfrm>
                     <a:prstGeom prst="rect">
                       <a:avLst/>
@@ -3127,7 +3196,7 @@
         <w:pStyle w:val="u2"/>
       </w:pPr>
       <w:bookmarkStart w:id="32" w:name="luồng-xử-lý-workflow-hệ-thống"/>
-      <w:bookmarkStart w:id="33" w:name="_Toc228448690"/>
+      <w:bookmarkStart w:id="33" w:name="_Toc228449143"/>
       <w:bookmarkEnd w:id="30"/>
       <w:r>
         <w:lastRenderedPageBreak/>
@@ -3246,8 +3315,8 @@
           <w:noProof/>
         </w:rPr>
         <w:drawing>
-          <wp:inline distT="0" distB="0" distL="0" distR="0" wp14:anchorId="6BF41201" wp14:editId="0D639BD0">
-            <wp:extent cx="5715000" cy="3273003"/>
+          <wp:inline distT="0" distB="0" distL="0" distR="0" wp14:anchorId="478C53C4" wp14:editId="6D765626">
+            <wp:extent cx="5715000" cy="3168972"/>
             <wp:effectExtent l="0" t="0" r="0" b="0"/>
             <wp:docPr id="32" name="Picture" descr="Hình 3.3: Luồng xử lý hệ thống"/>
             <wp:cNvGraphicFramePr/>
@@ -3269,7 +3338,7 @@
                   <pic:spPr bwMode="auto">
                     <a:xfrm>
                       <a:off x="0" y="0"/>
-                      <a:ext cx="5715000" cy="3273003"/>
+                      <a:ext cx="5715000" cy="3168972"/>
                     </a:xfrm>
                     <a:prstGeom prst="rect">
                       <a:avLst/>
@@ -3298,7 +3367,7 @@
         <w:pStyle w:val="u2"/>
       </w:pPr>
       <w:bookmarkStart w:id="34" w:name="thiết-kế-database"/>
-      <w:bookmarkStart w:id="35" w:name="_Toc228448691"/>
+      <w:bookmarkStart w:id="35" w:name="_Toc228449144"/>
       <w:bookmarkEnd w:id="32"/>
       <w:r>
         <w:t>3.4. Thiết kế Database</w:t>
@@ -3330,7 +3399,7 @@
         </w:rPr>
         <w:lastRenderedPageBreak/>
         <w:drawing>
-          <wp:inline distT="0" distB="0" distL="0" distR="0" wp14:anchorId="415D4052" wp14:editId="317967C0">
+          <wp:inline distT="0" distB="0" distL="0" distR="0" wp14:anchorId="6FD3E8BD" wp14:editId="2F947B18">
             <wp:extent cx="5473700" cy="4546600"/>
             <wp:effectExtent l="0" t="0" r="0" b="0"/>
             <wp:docPr id="36" name="Picture" descr="Hình 3.4: Thiết kế Database"/>
@@ -3382,7 +3451,7 @@
         <w:pStyle w:val="u1"/>
       </w:pPr>
       <w:bookmarkStart w:id="36" w:name="chương-4-cài-đặt-hệ-thống"/>
-      <w:bookmarkStart w:id="37" w:name="_Toc228448692"/>
+      <w:bookmarkStart w:id="37" w:name="_Toc228449145"/>
       <w:bookmarkEnd w:id="22"/>
       <w:bookmarkEnd w:id="34"/>
       <w:r>
@@ -3395,7 +3464,7 @@
         <w:pStyle w:val="u2"/>
       </w:pPr>
       <w:bookmarkStart w:id="38" w:name="môi-trường-phát-triển"/>
-      <w:bookmarkStart w:id="39" w:name="_Toc228448693"/>
+      <w:bookmarkStart w:id="39" w:name="_Toc228449146"/>
       <w:r>
         <w:t>4.1. Môi trường phát triển</w:t>
       </w:r>
@@ -3478,7 +3547,7 @@
         <w:pStyle w:val="u2"/>
       </w:pPr>
       <w:bookmarkStart w:id="40" w:name="cài-đặt-cloud-function-và-vision-api"/>
-      <w:bookmarkStart w:id="41" w:name="_Toc228448694"/>
+      <w:bookmarkStart w:id="41" w:name="_Toc228449147"/>
       <w:bookmarkEnd w:id="38"/>
       <w:r>
         <w:t>4.2. Cài đặt Cloud Function và Vision API</w:t>
@@ -3524,7 +3593,7 @@
         <w:pStyle w:val="u2"/>
       </w:pPr>
       <w:bookmarkStart w:id="42" w:name="cài-đặt-frontend-react"/>
-      <w:bookmarkStart w:id="43" w:name="_Toc228448695"/>
+      <w:bookmarkStart w:id="43" w:name="_Toc228449148"/>
       <w:bookmarkEnd w:id="40"/>
       <w:r>
         <w:t>4.3. Cài đặt Frontend (React)</w:t>
@@ -3558,7 +3627,7 @@
         <w:pStyle w:val="u2"/>
       </w:pPr>
       <w:bookmarkStart w:id="44" w:name="cấu-hình-google-cloud-storage"/>
-      <w:bookmarkStart w:id="45" w:name="_Toc228448696"/>
+      <w:bookmarkStart w:id="45" w:name="_Toc228449149"/>
       <w:bookmarkEnd w:id="42"/>
       <w:r>
         <w:t>4.4. Cấu hình Google Cloud Storage</w:t>
@@ -3592,7 +3661,7 @@
         <w:pStyle w:val="u1"/>
       </w:pPr>
       <w:bookmarkStart w:id="46" w:name="chương-5-kết-quả-đánh-giá"/>
-      <w:bookmarkStart w:id="47" w:name="_Toc228448697"/>
+      <w:bookmarkStart w:id="47" w:name="_Toc228449150"/>
       <w:bookmarkEnd w:id="36"/>
       <w:bookmarkEnd w:id="44"/>
       <w:r>
@@ -3605,7 +3674,7 @@
         <w:pStyle w:val="u2"/>
       </w:pPr>
       <w:bookmarkStart w:id="48" w:name="kết-quả-đạt-được"/>
-      <w:bookmarkStart w:id="49" w:name="_Toc228448698"/>
+      <w:bookmarkStart w:id="49" w:name="_Toc228449151"/>
       <w:r>
         <w:t>5.1. Kết quả đạt được</w:t>
       </w:r>
@@ -3649,7 +3718,7 @@
         <w:pStyle w:val="u2"/>
       </w:pPr>
       <w:bookmarkStart w:id="50" w:name="đánh-giá"/>
-      <w:bookmarkStart w:id="51" w:name="_Toc228448699"/>
+      <w:bookmarkStart w:id="51" w:name="_Toc228449152"/>
       <w:bookmarkEnd w:id="48"/>
       <w:r>
         <w:t>5.2. Đánh giá</w:t>
@@ -3661,7 +3730,7 @@
         <w:pStyle w:val="u3"/>
       </w:pPr>
       <w:bookmarkStart w:id="52" w:name="ưu-điểm"/>
-      <w:bookmarkStart w:id="53" w:name="_Toc228448700"/>
+      <w:bookmarkStart w:id="53" w:name="_Toc228449153"/>
       <w:r>
         <w:t>Ưu điểm</w:t>
       </w:r>
@@ -3694,7 +3763,7 @@
         <w:pStyle w:val="u3"/>
       </w:pPr>
       <w:bookmarkStart w:id="54" w:name="nhược-điểm"/>
-      <w:bookmarkStart w:id="55" w:name="_Toc228448701"/>
+      <w:bookmarkStart w:id="55" w:name="_Toc228449154"/>
       <w:bookmarkEnd w:id="52"/>
       <w:r>
         <w:t>Nhược điểm</w:t>
@@ -3729,7 +3798,7 @@
         <w:pStyle w:val="u1"/>
       </w:pPr>
       <w:bookmarkStart w:id="56" w:name="chương-6-hướng-phát-triển"/>
-      <w:bookmarkStart w:id="57" w:name="_Toc228448702"/>
+      <w:bookmarkStart w:id="57" w:name="_Toc228449155"/>
       <w:bookmarkEnd w:id="46"/>
       <w:bookmarkEnd w:id="50"/>
       <w:bookmarkEnd w:id="54"/>
@@ -3765,7 +3834,7 @@
         <w:pStyle w:val="u1"/>
       </w:pPr>
       <w:bookmarkStart w:id="58" w:name="chương-7-kết-luận"/>
-      <w:bookmarkStart w:id="59" w:name="_Toc228448703"/>
+      <w:bookmarkStart w:id="59" w:name="_Toc228449156"/>
       <w:bookmarkEnd w:id="56"/>
       <w:r>
         <w:t>CHƯƠNG 7: KẾT LUẬN</w:t>
@@ -3782,7 +3851,7 @@
         <w:pStyle w:val="u1"/>
       </w:pPr>
       <w:bookmarkStart w:id="60" w:name="tài-liệu-tham-khảo"/>
-      <w:bookmarkStart w:id="61" w:name="_Toc228448704"/>
+      <w:bookmarkStart w:id="61" w:name="_Toc228449157"/>
       <w:bookmarkEnd w:id="58"/>
       <w:r>
         <w:t>TÀI LIỆU THAM KHẢO</w:t>
@@ -4009,7 +4078,7 @@
   <w:abstractNum w:abstractNumId="9" w15:restartNumberingAfterBreak="0">
     <w:nsid w:val="0000A990"/>
     <w:multiLevelType w:val="multilevel"/>
-    <w:tmpl w:val="72A814A6"/>
+    <w:tmpl w:val="A8C4DE2C"/>
     <w:lvl w:ilvl="0">
       <w:numFmt w:val="bullet"/>
       <w:lvlText w:val=" "/>
@@ -4086,7 +4155,7 @@
   <w:abstractNum w:abstractNumId="10" w15:restartNumberingAfterBreak="0">
     <w:nsid w:val="0000A991"/>
     <w:multiLevelType w:val="multilevel"/>
-    <w:tmpl w:val="FC3C2658"/>
+    <w:tmpl w:val="3CC242E8"/>
     <w:lvl w:ilvl="0">
       <w:numFmt w:val="bullet"/>
       <w:lvlText w:val=""/>
@@ -4190,7 +4259,7 @@
   <w:abstractNum w:abstractNumId="11" w15:restartNumberingAfterBreak="0">
     <w:nsid w:val="00A99411"/>
     <w:multiLevelType w:val="multilevel"/>
-    <w:tmpl w:val="596E358A"/>
+    <w:tmpl w:val="36D4E3A0"/>
     <w:lvl w:ilvl="0">
       <w:start w:val="1"/>
       <w:numFmt w:val="decimal"/>
@@ -4300,10 +4369,10 @@
   <w:num w:numId="9" w16cid:durableId="2008286336">
     <w:abstractNumId w:val="0"/>
   </w:num>
-  <w:num w:numId="10" w16cid:durableId="2000111237">
+  <w:num w:numId="10" w16cid:durableId="956713187">
     <w:abstractNumId w:val="9"/>
   </w:num>
-  <w:num w:numId="11" w16cid:durableId="2088989834">
+  <w:num w:numId="11" w16cid:durableId="591007559">
     <w:abstractNumId w:val="11"/>
     <w:lvlOverride w:ilvl="0">
       <w:startOverride w:val="1"/>
@@ -4333,34 +4402,34 @@
       <w:startOverride w:val="1"/>
     </w:lvlOverride>
   </w:num>
-  <w:num w:numId="12" w16cid:durableId="1647664498">
+  <w:num w:numId="12" w16cid:durableId="1048453328">
     <w:abstractNumId w:val="10"/>
   </w:num>
-  <w:num w:numId="13" w16cid:durableId="813110139">
+  <w:num w:numId="13" w16cid:durableId="1623152261">
     <w:abstractNumId w:val="10"/>
   </w:num>
-  <w:num w:numId="14" w16cid:durableId="1452820462">
+  <w:num w:numId="14" w16cid:durableId="1987276687">
     <w:abstractNumId w:val="10"/>
   </w:num>
-  <w:num w:numId="15" w16cid:durableId="1417433455">
+  <w:num w:numId="15" w16cid:durableId="175316751">
     <w:abstractNumId w:val="10"/>
   </w:num>
-  <w:num w:numId="16" w16cid:durableId="1516338742">
+  <w:num w:numId="16" w16cid:durableId="548804644">
     <w:abstractNumId w:val="10"/>
   </w:num>
-  <w:num w:numId="17" w16cid:durableId="1232733879">
+  <w:num w:numId="17" w16cid:durableId="786856974">
     <w:abstractNumId w:val="10"/>
   </w:num>
-  <w:num w:numId="18" w16cid:durableId="1230771560">
+  <w:num w:numId="18" w16cid:durableId="233055412">
     <w:abstractNumId w:val="10"/>
   </w:num>
-  <w:num w:numId="19" w16cid:durableId="89547794">
+  <w:num w:numId="19" w16cid:durableId="1235550712">
     <w:abstractNumId w:val="10"/>
   </w:num>
-  <w:num w:numId="20" w16cid:durableId="2100514577">
+  <w:num w:numId="20" w16cid:durableId="1161888457">
     <w:abstractNumId w:val="10"/>
   </w:num>
-  <w:num w:numId="21" w16cid:durableId="790516168">
+  <w:num w:numId="21" w16cid:durableId="1789201610">
     <w:abstractNumId w:val="11"/>
     <w:lvlOverride w:ilvl="0">
       <w:startOverride w:val="1"/>
@@ -4390,7 +4459,7 @@
       <w:startOverride w:val="1"/>
     </w:lvlOverride>
   </w:num>
-  <w:num w:numId="22" w16cid:durableId="448822889">
+  <w:num w:numId="22" w16cid:durableId="2091390008">
     <w:abstractNumId w:val="11"/>
     <w:lvlOverride w:ilvl="0">
       <w:startOverride w:val="1"/>
@@ -4420,37 +4489,37 @@
       <w:startOverride w:val="1"/>
     </w:lvlOverride>
   </w:num>
-  <w:num w:numId="23" w16cid:durableId="1731883670">
+  <w:num w:numId="23" w16cid:durableId="2059863138">
     <w:abstractNumId w:val="10"/>
   </w:num>
-  <w:num w:numId="24" w16cid:durableId="213932797">
+  <w:num w:numId="24" w16cid:durableId="966933938">
     <w:abstractNumId w:val="10"/>
   </w:num>
-  <w:num w:numId="25" w16cid:durableId="652874985">
+  <w:num w:numId="25" w16cid:durableId="1672445026">
     <w:abstractNumId w:val="10"/>
   </w:num>
-  <w:num w:numId="26" w16cid:durableId="966278030">
+  <w:num w:numId="26" w16cid:durableId="561331004">
     <w:abstractNumId w:val="10"/>
   </w:num>
-  <w:num w:numId="27" w16cid:durableId="203446485">
+  <w:num w:numId="27" w16cid:durableId="1735161796">
     <w:abstractNumId w:val="10"/>
   </w:num>
-  <w:num w:numId="28" w16cid:durableId="825903669">
+  <w:num w:numId="28" w16cid:durableId="851575789">
     <w:abstractNumId w:val="10"/>
   </w:num>
-  <w:num w:numId="29" w16cid:durableId="1205484104">
+  <w:num w:numId="29" w16cid:durableId="963773821">
     <w:abstractNumId w:val="10"/>
   </w:num>
-  <w:num w:numId="30" w16cid:durableId="420222802">
+  <w:num w:numId="30" w16cid:durableId="2132627154">
     <w:abstractNumId w:val="10"/>
   </w:num>
-  <w:num w:numId="31" w16cid:durableId="1700549772">
+  <w:num w:numId="31" w16cid:durableId="2142729990">
     <w:abstractNumId w:val="10"/>
   </w:num>
-  <w:num w:numId="32" w16cid:durableId="327101196">
+  <w:num w:numId="32" w16cid:durableId="1314214293">
     <w:abstractNumId w:val="10"/>
   </w:num>
-  <w:num w:numId="33" w16cid:durableId="1420131191">
+  <w:num w:numId="33" w16cid:durableId="165558413">
     <w:abstractNumId w:val="11"/>
     <w:lvlOverride w:ilvl="0">
       <w:startOverride w:val="1"/>
@@ -16061,7 +16130,7 @@
     <w:autoRedefine/>
     <w:uiPriority w:val="39"/>
     <w:unhideWhenUsed/>
-    <w:rsid w:val="005D75F8"/>
+    <w:rsid w:val="006F334A"/>
     <w:pPr>
       <w:spacing w:after="100"/>
     </w:pPr>
@@ -16073,7 +16142,7 @@
     <w:autoRedefine/>
     <w:uiPriority w:val="39"/>
     <w:unhideWhenUsed/>
-    <w:rsid w:val="005D75F8"/>
+    <w:rsid w:val="006F334A"/>
     <w:pPr>
       <w:spacing w:after="100"/>
       <w:ind w:left="260"/>
@@ -16086,7 +16155,7 @@
     <w:autoRedefine/>
     <w:uiPriority w:val="39"/>
     <w:unhideWhenUsed/>
-    <w:rsid w:val="005D75F8"/>
+    <w:rsid w:val="006F334A"/>
     <w:pPr>
       <w:spacing w:after="100"/>
       <w:ind w:left="520"/>
@@ -16097,7 +16166,7 @@
     <w:basedOn w:val="Phngmcinhcuaoanvn"/>
     <w:uiPriority w:val="99"/>
     <w:unhideWhenUsed/>
-    <w:rsid w:val="005D75F8"/>
+    <w:rsid w:val="006F334A"/>
     <w:rPr>
       <w:color w:val="0000FF" w:themeColor="hyperlink"/>
       <w:u w:val="single"/>
@@ -16431,7 +16500,7 @@
 </file>
 
 <file path=customXml/itemProps1.xml><?xml version="1.0" encoding="utf-8"?>
-<ds:datastoreItem xmlns:ds="http://schemas.openxmlformats.org/officeDocument/2006/customXml" ds:itemID="{DC9C389E-9EC5-441E-8598-29606390DBC8}">
+<ds:datastoreItem xmlns:ds="http://schemas.openxmlformats.org/officeDocument/2006/customXml" ds:itemID="{C5E06D63-ADB7-4DE7-8FA6-78E364694ABE}">
   <ds:schemaRefs>
     <ds:schemaRef ds:uri="http://schemas.openxmlformats.org/officeDocument/2006/bibliography"/>
   </ds:schemaRefs>

</xml_diff>